<commit_message>
Ajuste PDF - repositorio
</commit_message>
<xml_diff>
--- a/fuentes/52450481_CF02_DU.docx
+++ b/fuentes/52450481_CF02_DU.docx
@@ -347,7 +347,7 @@
               </wp:anchor>
             </w:drawing>
           </mc:Choice>
-          <mc:Fallback xmlns:a="http://schemas.openxmlformats.org/drawingml/2006/main" xmlns:adec="http://schemas.microsoft.com/office/drawing/2017/decorative" xmlns:pic="http://schemas.openxmlformats.org/drawingml/2006/picture" xmlns:a14="http://schemas.microsoft.com/office/drawing/2010/main" xmlns:asvg="http://schemas.microsoft.com/office/drawing/2016/SVG/main">
+          <mc:Fallback xmlns:asvg="http://schemas.microsoft.com/office/drawing/2016/SVG/main" xmlns:a14="http://schemas.microsoft.com/office/drawing/2010/main" xmlns:pic="http://schemas.openxmlformats.org/drawingml/2006/picture" xmlns:adec="http://schemas.microsoft.com/office/drawing/2017/decorative" xmlns:a="http://schemas.openxmlformats.org/drawingml/2006/main">
             <w:pict>
               <v:rect id="Rectángulo 3" style="position:absolute;margin-left:-55.95pt;margin-top:26.4pt;width:613.85pt;height:164.25pt;z-index:-251655168;visibility:visible;mso-wrap-style:square;mso-height-percent:0;mso-wrap-distance-left:9pt;mso-wrap-distance-top:0;mso-wrap-distance-right:9pt;mso-wrap-distance-bottom:0;mso-position-horizontal:absolute;mso-position-horizontal-relative:text;mso-position-vertical:absolute;mso-position-vertical-relative:text;mso-height-percent:0;mso-height-relative:margin;v-text-anchor:middle" o:spid="_x0000_s1026" fillcolor="#00314d" stroked="f" strokeweight="1pt" w14:anchorId="3617F850" o:gfxdata="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"/>
             </w:pict>
@@ -590,7 +590,7 @@
           <w:r>
             <w:fldChar w:fldCharType="separate"/>
           </w:r>
-          <w:hyperlink w:anchor="_Toc201335694" w:history="1">
+          <w:hyperlink w:anchor="_Toc201852685" w:history="1">
             <w:r>
               <w:rPr>
                 <w:rStyle w:val="Hipervnculo"/>
@@ -617,7 +617,7 @@
                 <w:noProof/>
                 <w:webHidden/>
               </w:rPr>
-              <w:instrText xml:space="preserve"> PAGEREF _Toc201335694 \h </w:instrText>
+              <w:instrText xml:space="preserve"> PAGEREF _Toc201852685 \h </w:instrText>
             </w:r>
             <w:r>
               <w:rPr>
@@ -663,7 +663,7 @@
               <w:lang w:eastAsia="es-CO"/>
             </w:rPr>
           </w:pPr>
-          <w:hyperlink w:anchor="_Toc201335695" w:history="1">
+          <w:hyperlink w:anchor="_Toc201852686" w:history="1">
             <w:r>
               <w:rPr>
                 <w:rStyle w:val="Hipervnculo"/>
@@ -707,7 +707,7 @@
                 <w:noProof/>
                 <w:webHidden/>
               </w:rPr>
-              <w:instrText xml:space="preserve"> PAGEREF _Toc201335695 \h </w:instrText>
+              <w:instrText xml:space="preserve"> PAGEREF _Toc201852686 \h </w:instrText>
             </w:r>
             <w:r>
               <w:rPr>
@@ -753,7 +753,7 @@
               <w:lang w:eastAsia="es-CO"/>
             </w:rPr>
           </w:pPr>
-          <w:hyperlink w:anchor="_Toc201335696" w:history="1">
+          <w:hyperlink w:anchor="_Toc201852687" w:history="1">
             <w:r>
               <w:rPr>
                 <w:rStyle w:val="Hipervnculo"/>
@@ -803,7 +803,7 @@
                 <w:noProof/>
                 <w:webHidden/>
               </w:rPr>
-              <w:instrText xml:space="preserve"> PAGEREF _Toc201335696 \h </w:instrText>
+              <w:instrText xml:space="preserve"> PAGEREF _Toc201852687 \h </w:instrText>
             </w:r>
             <w:r>
               <w:rPr>
@@ -823,7 +823,7 @@
                 <w:noProof/>
                 <w:webHidden/>
               </w:rPr>
-              <w:t>5</w:t>
+              <w:t>6</w:t>
             </w:r>
             <w:r>
               <w:rPr>
@@ -849,7 +849,7 @@
               <w:lang w:eastAsia="es-CO"/>
             </w:rPr>
           </w:pPr>
-          <w:hyperlink w:anchor="_Toc201335697" w:history="1">
+          <w:hyperlink w:anchor="_Toc201852688" w:history="1">
             <w:r>
               <w:rPr>
                 <w:rStyle w:val="Hipervnculo"/>
@@ -899,7 +899,7 @@
                 <w:noProof/>
                 <w:webHidden/>
               </w:rPr>
-              <w:instrText xml:space="preserve"> PAGEREF _Toc201335697 \h </w:instrText>
+              <w:instrText xml:space="preserve"> PAGEREF _Toc201852688 \h </w:instrText>
             </w:r>
             <w:r>
               <w:rPr>
@@ -919,7 +919,7 @@
                 <w:noProof/>
                 <w:webHidden/>
               </w:rPr>
-              <w:t>7</w:t>
+              <w:t>8</w:t>
             </w:r>
             <w:r>
               <w:rPr>
@@ -945,7 +945,7 @@
               <w:lang w:eastAsia="es-CO"/>
             </w:rPr>
           </w:pPr>
-          <w:hyperlink w:anchor="_Toc201335698" w:history="1">
+          <w:hyperlink w:anchor="_Toc201852689" w:history="1">
             <w:r>
               <w:rPr>
                 <w:rStyle w:val="Hipervnculo"/>
@@ -995,7 +995,7 @@
                 <w:noProof/>
                 <w:webHidden/>
               </w:rPr>
-              <w:instrText xml:space="preserve"> PAGEREF _Toc201335698 \h </w:instrText>
+              <w:instrText xml:space="preserve"> PAGEREF _Toc201852689 \h </w:instrText>
             </w:r>
             <w:r>
               <w:rPr>
@@ -1015,7 +1015,7 @@
                 <w:noProof/>
                 <w:webHidden/>
               </w:rPr>
-              <w:t>8</w:t>
+              <w:t>9</w:t>
             </w:r>
             <w:r>
               <w:rPr>
@@ -1041,7 +1041,7 @@
               <w:lang w:eastAsia="es-CO"/>
             </w:rPr>
           </w:pPr>
-          <w:hyperlink w:anchor="_Toc201335699" w:history="1">
+          <w:hyperlink w:anchor="_Toc201852690" w:history="1">
             <w:r>
               <w:rPr>
                 <w:rStyle w:val="Hipervnculo"/>
@@ -1085,7 +1085,7 @@
                 <w:noProof/>
                 <w:webHidden/>
               </w:rPr>
-              <w:instrText xml:space="preserve"> PAGEREF _Toc201335699 \h </w:instrText>
+              <w:instrText xml:space="preserve"> PAGEREF _Toc201852690 \h </w:instrText>
             </w:r>
             <w:r>
               <w:rPr>
@@ -1105,7 +1105,7 @@
                 <w:noProof/>
                 <w:webHidden/>
               </w:rPr>
-              <w:t>12</w:t>
+              <w:t>13</w:t>
             </w:r>
             <w:r>
               <w:rPr>
@@ -1131,7 +1131,7 @@
               <w:lang w:eastAsia="es-CO"/>
             </w:rPr>
           </w:pPr>
-          <w:hyperlink w:anchor="_Toc201335700" w:history="1">
+          <w:hyperlink w:anchor="_Toc201852691" w:history="1">
             <w:r>
               <w:rPr>
                 <w:rStyle w:val="Hipervnculo"/>
@@ -1181,7 +1181,7 @@
                 <w:noProof/>
                 <w:webHidden/>
               </w:rPr>
-              <w:instrText xml:space="preserve"> PAGEREF _Toc201335700 \h </w:instrText>
+              <w:instrText xml:space="preserve"> PAGEREF _Toc201852691 \h </w:instrText>
             </w:r>
             <w:r>
               <w:rPr>
@@ -1201,7 +1201,7 @@
                 <w:noProof/>
                 <w:webHidden/>
               </w:rPr>
-              <w:t>12</w:t>
+              <w:t>13</w:t>
             </w:r>
             <w:r>
               <w:rPr>
@@ -1227,7 +1227,7 @@
               <w:lang w:eastAsia="es-CO"/>
             </w:rPr>
           </w:pPr>
-          <w:hyperlink w:anchor="_Toc201335701" w:history="1">
+          <w:hyperlink w:anchor="_Toc201852692" w:history="1">
             <w:r>
               <w:rPr>
                 <w:rStyle w:val="Hipervnculo"/>
@@ -1277,7 +1277,7 @@
                 <w:noProof/>
                 <w:webHidden/>
               </w:rPr>
-              <w:instrText xml:space="preserve"> PAGEREF _Toc201335701 \h </w:instrText>
+              <w:instrText xml:space="preserve"> PAGEREF _Toc201852692 \h </w:instrText>
             </w:r>
             <w:r>
               <w:rPr>
@@ -1297,7 +1297,7 @@
                 <w:noProof/>
                 <w:webHidden/>
               </w:rPr>
-              <w:t>19</w:t>
+              <w:t>20</w:t>
             </w:r>
             <w:r>
               <w:rPr>
@@ -1323,7 +1323,7 @@
               <w:lang w:eastAsia="es-CO"/>
             </w:rPr>
           </w:pPr>
-          <w:hyperlink w:anchor="_Toc201335702" w:history="1">
+          <w:hyperlink w:anchor="_Toc201852693" w:history="1">
             <w:r>
               <w:rPr>
                 <w:rStyle w:val="Hipervnculo"/>
@@ -1373,7 +1373,7 @@
                 <w:noProof/>
                 <w:webHidden/>
               </w:rPr>
-              <w:instrText xml:space="preserve"> PAGEREF _Toc201335702 \h </w:instrText>
+              <w:instrText xml:space="preserve"> PAGEREF _Toc201852693 \h </w:instrText>
             </w:r>
             <w:r>
               <w:rPr>
@@ -1393,7 +1393,7 @@
                 <w:noProof/>
                 <w:webHidden/>
               </w:rPr>
-              <w:t>24</w:t>
+              <w:t>25</w:t>
             </w:r>
             <w:r>
               <w:rPr>
@@ -1419,7 +1419,7 @@
               <w:lang w:eastAsia="es-CO"/>
             </w:rPr>
           </w:pPr>
-          <w:hyperlink w:anchor="_Toc201335703" w:history="1">
+          <w:hyperlink w:anchor="_Toc201852694" w:history="1">
             <w:r>
               <w:rPr>
                 <w:rStyle w:val="Hipervnculo"/>
@@ -1463,7 +1463,7 @@
                 <w:noProof/>
                 <w:webHidden/>
               </w:rPr>
-              <w:instrText xml:space="preserve"> PAGEREF _Toc201335703 \h </w:instrText>
+              <w:instrText xml:space="preserve"> PAGEREF _Toc201852694 \h </w:instrText>
             </w:r>
             <w:r>
               <w:rPr>
@@ -1483,7 +1483,7 @@
                 <w:noProof/>
                 <w:webHidden/>
               </w:rPr>
-              <w:t>28</w:t>
+              <w:t>29</w:t>
             </w:r>
             <w:r>
               <w:rPr>
@@ -1509,7 +1509,7 @@
               <w:lang w:eastAsia="es-CO"/>
             </w:rPr>
           </w:pPr>
-          <w:hyperlink w:anchor="_Toc201335704" w:history="1">
+          <w:hyperlink w:anchor="_Toc201852695" w:history="1">
             <w:r>
               <w:rPr>
                 <w:rStyle w:val="Hipervnculo"/>
@@ -1559,7 +1559,7 @@
                 <w:noProof/>
                 <w:webHidden/>
               </w:rPr>
-              <w:instrText xml:space="preserve"> PAGEREF _Toc201335704 \h </w:instrText>
+              <w:instrText xml:space="preserve"> PAGEREF _Toc201852695 \h </w:instrText>
             </w:r>
             <w:r>
               <w:rPr>
@@ -1579,7 +1579,7 @@
                 <w:noProof/>
                 <w:webHidden/>
               </w:rPr>
-              <w:t>28</w:t>
+              <w:t>29</w:t>
             </w:r>
             <w:r>
               <w:rPr>
@@ -1605,7 +1605,7 @@
               <w:lang w:eastAsia="es-CO"/>
             </w:rPr>
           </w:pPr>
-          <w:hyperlink w:anchor="_Toc201335705" w:history="1">
+          <w:hyperlink w:anchor="_Toc201852696" w:history="1">
             <w:r>
               <w:rPr>
                 <w:rStyle w:val="Hipervnculo"/>
@@ -1655,7 +1655,7 @@
                 <w:noProof/>
                 <w:webHidden/>
               </w:rPr>
-              <w:instrText xml:space="preserve"> PAGEREF _Toc201335705 \h </w:instrText>
+              <w:instrText xml:space="preserve"> PAGEREF _Toc201852696 \h </w:instrText>
             </w:r>
             <w:r>
               <w:rPr>
@@ -1675,7 +1675,7 @@
                 <w:noProof/>
                 <w:webHidden/>
               </w:rPr>
-              <w:t>30</w:t>
+              <w:t>31</w:t>
             </w:r>
             <w:r>
               <w:rPr>
@@ -1701,7 +1701,7 @@
               <w:lang w:eastAsia="es-CO"/>
             </w:rPr>
           </w:pPr>
-          <w:hyperlink w:anchor="_Toc201335706" w:history="1">
+          <w:hyperlink w:anchor="_Toc201852697" w:history="1">
             <w:r>
               <w:rPr>
                 <w:rStyle w:val="Hipervnculo"/>
@@ -1751,7 +1751,7 @@
                 <w:noProof/>
                 <w:webHidden/>
               </w:rPr>
-              <w:instrText xml:space="preserve"> PAGEREF _Toc201335706 \h </w:instrText>
+              <w:instrText xml:space="preserve"> PAGEREF _Toc201852697 \h </w:instrText>
             </w:r>
             <w:r>
               <w:rPr>
@@ -1771,7 +1771,7 @@
                 <w:noProof/>
                 <w:webHidden/>
               </w:rPr>
-              <w:t>30</w:t>
+              <w:t>31</w:t>
             </w:r>
             <w:r>
               <w:rPr>
@@ -1797,7 +1797,7 @@
               <w:lang w:eastAsia="es-CO"/>
             </w:rPr>
           </w:pPr>
-          <w:hyperlink w:anchor="_Toc201335707" w:history="1">
+          <w:hyperlink w:anchor="_Toc201852698" w:history="1">
             <w:r>
               <w:rPr>
                 <w:rStyle w:val="Hipervnculo"/>
@@ -1841,7 +1841,7 @@
                 <w:noProof/>
                 <w:webHidden/>
               </w:rPr>
-              <w:instrText xml:space="preserve"> PAGEREF _Toc201335707 \h </w:instrText>
+              <w:instrText xml:space="preserve"> PAGEREF _Toc201852698 \h </w:instrText>
             </w:r>
             <w:r>
               <w:rPr>
@@ -1861,7 +1861,7 @@
                 <w:noProof/>
                 <w:webHidden/>
               </w:rPr>
-              <w:t>32</w:t>
+              <w:t>33</w:t>
             </w:r>
             <w:r>
               <w:rPr>
@@ -1887,7 +1887,7 @@
               <w:lang w:eastAsia="es-CO"/>
             </w:rPr>
           </w:pPr>
-          <w:hyperlink w:anchor="_Toc201335708" w:history="1">
+          <w:hyperlink w:anchor="_Toc201852699" w:history="1">
             <w:r>
               <w:rPr>
                 <w:rStyle w:val="Hipervnculo"/>
@@ -1931,7 +1931,7 @@
                 <w:noProof/>
                 <w:webHidden/>
               </w:rPr>
-              <w:instrText xml:space="preserve"> PAGEREF _Toc201335708 \h </w:instrText>
+              <w:instrText xml:space="preserve"> PAGEREF _Toc201852699 \h </w:instrText>
             </w:r>
             <w:r>
               <w:rPr>
@@ -1951,7 +1951,7 @@
                 <w:noProof/>
                 <w:webHidden/>
               </w:rPr>
-              <w:t>34</w:t>
+              <w:t>35</w:t>
             </w:r>
             <w:r>
               <w:rPr>
@@ -1976,7 +1976,7 @@
               <w:lang w:eastAsia="es-CO"/>
             </w:rPr>
           </w:pPr>
-          <w:hyperlink w:anchor="_Toc201335709" w:history="1">
+          <w:hyperlink w:anchor="_Toc201852700" w:history="1">
             <w:r>
               <w:rPr>
                 <w:rStyle w:val="Hipervnculo"/>
@@ -2003,7 +2003,7 @@
                 <w:noProof/>
                 <w:webHidden/>
               </w:rPr>
-              <w:instrText xml:space="preserve"> PAGEREF _Toc201335709 \h </w:instrText>
+              <w:instrText xml:space="preserve"> PAGEREF _Toc201852700 \h </w:instrText>
             </w:r>
             <w:r>
               <w:rPr>
@@ -2023,7 +2023,7 @@
                 <w:noProof/>
                 <w:webHidden/>
               </w:rPr>
-              <w:t>40</w:t>
+              <w:t>41</w:t>
             </w:r>
             <w:r>
               <w:rPr>
@@ -2048,7 +2048,7 @@
               <w:lang w:eastAsia="es-CO"/>
             </w:rPr>
           </w:pPr>
-          <w:hyperlink w:anchor="_Toc201335710" w:history="1">
+          <w:hyperlink w:anchor="_Toc201852701" w:history="1">
             <w:r>
               <w:rPr>
                 <w:rStyle w:val="Hipervnculo"/>
@@ -2075,7 +2075,7 @@
                 <w:noProof/>
                 <w:webHidden/>
               </w:rPr>
-              <w:instrText xml:space="preserve"> PAGEREF _Toc201335710 \h </w:instrText>
+              <w:instrText xml:space="preserve"> PAGEREF _Toc201852701 \h </w:instrText>
             </w:r>
             <w:r>
               <w:rPr>
@@ -2095,7 +2095,7 @@
                 <w:noProof/>
                 <w:webHidden/>
               </w:rPr>
-              <w:t>41</w:t>
+              <w:t>42</w:t>
             </w:r>
             <w:r>
               <w:rPr>
@@ -2120,7 +2120,7 @@
               <w:lang w:eastAsia="es-CO"/>
             </w:rPr>
           </w:pPr>
-          <w:hyperlink w:anchor="_Toc201335711" w:history="1">
+          <w:hyperlink w:anchor="_Toc201852702" w:history="1">
             <w:r>
               <w:rPr>
                 <w:rStyle w:val="Hipervnculo"/>
@@ -2147,7 +2147,7 @@
                 <w:noProof/>
                 <w:webHidden/>
               </w:rPr>
-              <w:instrText xml:space="preserve"> PAGEREF _Toc201335711 \h </w:instrText>
+              <w:instrText xml:space="preserve"> PAGEREF _Toc201852702 \h </w:instrText>
             </w:r>
             <w:r>
               <w:rPr>
@@ -2167,7 +2167,7 @@
                 <w:noProof/>
                 <w:webHidden/>
               </w:rPr>
-              <w:t>42</w:t>
+              <w:t>43</w:t>
             </w:r>
             <w:r>
               <w:rPr>
@@ -2192,7 +2192,7 @@
               <w:lang w:eastAsia="es-CO"/>
             </w:rPr>
           </w:pPr>
-          <w:hyperlink w:anchor="_Toc201335712" w:history="1">
+          <w:hyperlink w:anchor="_Toc201852703" w:history="1">
             <w:r>
               <w:rPr>
                 <w:rStyle w:val="Hipervnculo"/>
@@ -2219,7 +2219,7 @@
                 <w:noProof/>
                 <w:webHidden/>
               </w:rPr>
-              <w:instrText xml:space="preserve"> PAGEREF _Toc201335712 \h </w:instrText>
+              <w:instrText xml:space="preserve"> PAGEREF _Toc201852703 \h </w:instrText>
             </w:r>
             <w:r>
               <w:rPr>
@@ -2239,7 +2239,7 @@
                 <w:noProof/>
                 <w:webHidden/>
               </w:rPr>
-              <w:t>43</w:t>
+              <w:t>44</w:t>
             </w:r>
             <w:r>
               <w:rPr>
@@ -2264,7 +2264,7 @@
               <w:lang w:eastAsia="es-CO"/>
             </w:rPr>
           </w:pPr>
-          <w:hyperlink w:anchor="_Toc201335713" w:history="1">
+          <w:hyperlink w:anchor="_Toc201852704" w:history="1">
             <w:r>
               <w:rPr>
                 <w:rStyle w:val="Hipervnculo"/>
@@ -2291,7 +2291,7 @@
                 <w:noProof/>
                 <w:webHidden/>
               </w:rPr>
-              <w:instrText xml:space="preserve"> PAGEREF _Toc201335713 \h </w:instrText>
+              <w:instrText xml:space="preserve"> PAGEREF _Toc201852704 \h </w:instrText>
             </w:r>
             <w:r>
               <w:rPr>
@@ -2311,7 +2311,7 @@
                 <w:noProof/>
                 <w:webHidden/>
               </w:rPr>
-              <w:t>44</w:t>
+              <w:t>45</w:t>
             </w:r>
             <w:r>
               <w:rPr>
@@ -2333,7 +2333,7 @@
       <w:pPr>
         <w:pStyle w:val="Titulosgenerales"/>
       </w:pPr>
-      <w:bookmarkStart w:id="0" w:name="_Toc201335694"/>
+      <w:bookmarkStart w:id="0" w:name="_Toc201852685"/>
       <w:r>
         <w:lastRenderedPageBreak/>
         <w:t>Introducción</w:t>
@@ -2371,7 +2371,7 @@
           <w:lang w:val="es-CO"/>
         </w:rPr>
       </w:pPr>
-      <w:bookmarkStart w:id="1" w:name="_Toc201335695"/>
+      <w:bookmarkStart w:id="1" w:name="_Toc201852686"/>
       <w:r>
         <w:rPr>
           <w:lang w:val="es-CO"/>
@@ -2396,9 +2396,176 @@
     </w:p>
     <w:p>
       <w:pPr>
+        <w:rPr>
+          <w:lang w:eastAsia="es-CO"/>
+        </w:rPr>
+      </w:pPr>
+      <w:r>
+        <w:rPr>
+          <w:lang w:eastAsia="es-CO"/>
+        </w:rPr>
+        <w:t>El paso a paso para tomar las medidas del pie y determinar la talla de calzado es:</w:t>
+      </w:r>
+    </w:p>
+    <w:p>
+      <w:pPr>
+        <w:pStyle w:val="Ttulo4"/>
+      </w:pPr>
+      <w:r>
+        <w:t>Preparar el material</w:t>
+      </w:r>
+    </w:p>
+    <w:p>
+      <w:pPr>
+        <w:rPr>
+          <w:lang w:eastAsia="es-CO"/>
+        </w:rPr>
+      </w:pPr>
+      <w:r>
+        <w:rPr>
+          <w:lang w:eastAsia="es-CO"/>
+        </w:rPr>
+        <w:t>Tener a la mano una hoja de papel, un lápiz y una regla o metro.</w:t>
+      </w:r>
+    </w:p>
+    <w:p>
+      <w:pPr>
+        <w:pStyle w:val="Ttulo4"/>
+        <w:rPr>
+          <w:lang w:val="es-CO"/>
+        </w:rPr>
+      </w:pPr>
+      <w:r>
+        <w:rPr>
+          <w:lang w:val="es-CO"/>
+        </w:rPr>
+        <w:t>Colocar el papel en el suelo</w:t>
+      </w:r>
+    </w:p>
+    <w:p>
+      <w:pPr>
+        <w:rPr>
+          <w:lang w:eastAsia="es-CO"/>
+        </w:rPr>
+      </w:pPr>
+      <w:r>
+        <w:rPr>
+          <w:lang w:eastAsia="es-CO"/>
+        </w:rPr>
+        <w:t>Ubicar el papel sobre una superficie lisa y estable. Debe ser lo suficientemente grande para que quepa todo el pie.</w:t>
+      </w:r>
+    </w:p>
+    <w:p>
+      <w:pPr>
+        <w:pStyle w:val="Ttulo4"/>
+      </w:pPr>
+      <w:r>
+        <w:t>Posición del pie</w:t>
+      </w:r>
+    </w:p>
+    <w:p>
+      <w:pPr>
+        <w:rPr>
+          <w:lang w:eastAsia="es-CO"/>
+        </w:rPr>
+      </w:pPr>
+      <w:r>
+        <w:rPr>
+          <w:lang w:eastAsia="es-CO"/>
+        </w:rPr>
+        <w:t>La persona debe ponerse de pie, con el peso distribuido de forma uniforme. Colocar el pie a medir en el centro de la hoja, sin mover talón ni dedos.</w:t>
+      </w:r>
+    </w:p>
+    <w:p>
+      <w:pPr>
+        <w:pStyle w:val="Ttulo4"/>
+      </w:pPr>
+      <w:r>
+        <w:t>Dibujar el contorno</w:t>
+      </w:r>
+    </w:p>
+    <w:p>
+      <w:pPr>
+        <w:rPr>
+          <w:lang w:eastAsia="es-CO"/>
+        </w:rPr>
+      </w:pPr>
+      <w:r>
+        <w:rPr>
+          <w:lang w:eastAsia="es-CO"/>
+        </w:rPr>
+        <w:t>Trazar el contorno del pie con el lápiz, manteniéndolo perpendicular a la hoja, sin inclinarlo hacia adentro ni hacia afuera.</w:t>
+      </w:r>
+    </w:p>
+    <w:p>
+      <w:pPr>
+        <w:pStyle w:val="Ttulo4"/>
+      </w:pPr>
+      <w:r>
+        <w:t>Marcar los puntos extremos</w:t>
+      </w:r>
+    </w:p>
+    <w:p>
+      <w:pPr>
+        <w:rPr>
+          <w:lang w:eastAsia="es-CO"/>
+        </w:rPr>
+      </w:pPr>
+      <w:r>
+        <w:rPr>
+          <w:lang w:eastAsia="es-CO"/>
+        </w:rPr>
+        <w:t>Identificar y señalar el punto más saliente del talón y el más lejano de la punta del dedo más largo (generalmente el dedo gordo).</w:t>
+      </w:r>
+    </w:p>
+    <w:p>
+      <w:pPr>
+        <w:pStyle w:val="Ttulo4"/>
+      </w:pPr>
+      <w:r>
+        <w:lastRenderedPageBreak/>
+        <w:t>Medir</w:t>
+      </w:r>
+    </w:p>
+    <w:p>
+      <w:pPr>
+        <w:rPr>
+          <w:lang w:eastAsia="es-CO"/>
+        </w:rPr>
+      </w:pPr>
+      <w:r>
+        <w:rPr>
+          <w:lang w:eastAsia="es-CO"/>
+        </w:rPr>
+        <w:t>Medir en línea recta la distancia entre los puntos marcados usando la regla o metro. Registrar el resultado en milímetros o centímetros.</w:t>
+      </w:r>
+    </w:p>
+    <w:p>
+      <w:pPr>
+        <w:pStyle w:val="Ttulo4"/>
+      </w:pPr>
+      <w:r>
+        <w:t>Determinar la talla</w:t>
+      </w:r>
+    </w:p>
+    <w:p>
+      <w:pPr>
+        <w:rPr>
+          <w:lang w:val="es-419" w:eastAsia="es-CO"/>
+        </w:rPr>
+      </w:pPr>
+      <w:r>
+        <w:rPr>
+          <w:lang w:eastAsia="es-CO"/>
+        </w:rPr>
+        <w:t>Consultar una tabla de equivalencias (americana, europea o del fabricante) para encontrar el número correspondiente a la longitud del pie medida.</w:t>
+      </w:r>
+    </w:p>
+    <w:p>
+      <w:pPr>
         <w:pStyle w:val="Ttulo2"/>
       </w:pPr>
-      <w:bookmarkStart w:id="2" w:name="_Toc201335696"/>
+      <w:bookmarkStart w:id="2" w:name="_Toc201852687"/>
       <w:r>
         <w:t>Principales sistemas de numeración de calzado</w:t>
       </w:r>
@@ -3048,7 +3215,7 @@
       <w:pPr>
         <w:pStyle w:val="Ttulo2"/>
       </w:pPr>
-      <w:bookmarkStart w:id="3" w:name="_Toc201335697"/>
+      <w:bookmarkStart w:id="3" w:name="_Toc201852688"/>
       <w:r>
         <w:t>Conversión básica entre sistemas</w:t>
       </w:r>
@@ -4513,7 +4680,7 @@
       <w:pPr>
         <w:pStyle w:val="Ttulo2"/>
       </w:pPr>
-      <w:bookmarkStart w:id="4" w:name="_Toc201335698"/>
+      <w:bookmarkStart w:id="4" w:name="_Toc201852689"/>
       <w:r>
         <w:t>Medida de ancho o volumen del pie</w:t>
       </w:r>
@@ -7745,7 +7912,7 @@
       <w:pPr>
         <w:pStyle w:val="Ttulo1"/>
       </w:pPr>
-      <w:bookmarkStart w:id="5" w:name="_Toc201335699"/>
+      <w:bookmarkStart w:id="5" w:name="_Toc201852690"/>
       <w:r>
         <w:lastRenderedPageBreak/>
         <w:t>Hormas</w:t>
@@ -7769,7 +7936,7 @@
       <w:pPr>
         <w:pStyle w:val="Ttulo2"/>
       </w:pPr>
-      <w:bookmarkStart w:id="6" w:name="_Toc201335700"/>
+      <w:bookmarkStart w:id="6" w:name="_Toc201852691"/>
       <w:r>
         <w:t>Partes de la horma</w:t>
       </w:r>
@@ -7858,7 +8025,6 @@
     </w:p>
     <w:p>
       <w:pPr>
-        <w:ind w:firstLine="0"/>
         <w:jc w:val="center"/>
         <w:rPr>
           <w:lang w:val="es-419" w:eastAsia="es-CO"/>
@@ -7869,10 +8035,10 @@
           <w:noProof/>
         </w:rPr>
         <w:drawing>
-          <wp:inline distT="0" distB="0" distL="0" distR="0" wp14:anchorId="047F9E23" wp14:editId="2E04CACD">
-            <wp:extent cx="5557632" cy="2095500"/>
-            <wp:effectExtent l="0" t="0" r="5080" b="0"/>
-            <wp:docPr id="2" name="Imagen 2" descr="Vista lateral superior de una horma de calzado de madera con una línea roja horizontal que atraviesa el centro, marcando la alineación longitudinal de la horma."/>
+          <wp:inline distT="0" distB="0" distL="0" distR="0" wp14:anchorId="79B73E95" wp14:editId="7FA88533">
+            <wp:extent cx="5191125" cy="1957309"/>
+            <wp:effectExtent l="0" t="0" r="0" b="5080"/>
+            <wp:docPr id="257866978" name="Imagen 3" descr="Vista lateral superior de una horma de calzado de madera con una línea roja horizontal que atraviesa el centro, marcando la alineación longitudinal de la horma."/>
             <wp:cNvGraphicFramePr>
               <a:graphicFrameLocks xmlns:a="http://schemas.openxmlformats.org/drawingml/2006/main" noChangeAspect="1"/>
             </wp:cNvGraphicFramePr>
@@ -7901,7 +8067,7 @@
                   <pic:spPr bwMode="auto">
                     <a:xfrm>
                       <a:off x="0" y="0"/>
-                      <a:ext cx="5584879" cy="2105773"/>
+                      <a:ext cx="5203791" cy="1962085"/>
                     </a:xfrm>
                     <a:prstGeom prst="rect">
                       <a:avLst/>
@@ -8024,7 +8190,6 @@
     </w:p>
     <w:p>
       <w:pPr>
-        <w:ind w:firstLine="0"/>
         <w:jc w:val="center"/>
         <w:rPr>
           <w:lang w:val="es-419" w:eastAsia="es-CO"/>
@@ -8035,10 +8200,10 @@
           <w:noProof/>
         </w:rPr>
         <w:drawing>
-          <wp:inline distT="0" distB="0" distL="0" distR="0" wp14:anchorId="0755AAC6" wp14:editId="5DFE57BA">
+          <wp:inline distT="0" distB="0" distL="0" distR="0" wp14:anchorId="3C0C95DD" wp14:editId="0455C667">
             <wp:extent cx="5810250" cy="2209800"/>
             <wp:effectExtent l="0" t="0" r="0" b="0"/>
-            <wp:docPr id="3" name="Imagen 3" descr="Vista lateral de una horma de calzado de madera con una línea vertical roja que indica la ubicación del punto de apoyo más alto del empeine."/>
+            <wp:docPr id="701971086" name="Imagen 4" descr="Vista lateral de una horma de calzado de madera con una línea vertical roja que indica la ubicación del punto de apoyo más alto del empeine."/>
             <wp:cNvGraphicFramePr>
               <a:graphicFrameLocks xmlns:a="http://schemas.openxmlformats.org/drawingml/2006/main" noChangeAspect="1"/>
             </wp:cNvGraphicFramePr>
@@ -8104,13 +8269,6 @@
           <w:lang w:eastAsia="es-CO"/>
         </w:rPr>
       </w:pPr>
-    </w:p>
-    <w:p>
-      <w:pPr>
-        <w:rPr>
-          <w:lang w:eastAsia="es-CO"/>
-        </w:rPr>
-      </w:pPr>
       <w:r>
         <w:rPr>
           <w:lang w:eastAsia="es-CO"/>
@@ -8202,7 +8360,6 @@
           <w:bCs/>
           <w:lang w:eastAsia="es-CO"/>
         </w:rPr>
-        <w:lastRenderedPageBreak/>
         <w:t>Apertura</w:t>
       </w:r>
       <w:r>
@@ -8230,6 +8387,7 @@
           <w:bCs/>
           <w:lang w:eastAsia="es-CO"/>
         </w:rPr>
+        <w:lastRenderedPageBreak/>
         <w:t>Talla</w:t>
       </w:r>
       <w:r>
@@ -8397,7 +8555,6 @@
         <w:rPr>
           <w:lang w:eastAsia="es-CO"/>
         </w:rPr>
-        <w:lastRenderedPageBreak/>
         <w:t>Además de las partes principales, existen componentes que cumplen funciones específicas en el diseño y la funcionalidad de la horma:</w:t>
       </w:r>
     </w:p>
@@ -8419,6 +8576,7 @@
           <w:bCs/>
           <w:lang w:eastAsia="es-CO"/>
         </w:rPr>
+        <w:lastRenderedPageBreak/>
         <w:t>Perfil de la puntera</w:t>
       </w:r>
       <w:r>
@@ -8627,7 +8785,6 @@
           <w:bCs/>
           <w:lang w:eastAsia="es-CO"/>
         </w:rPr>
-        <w:lastRenderedPageBreak/>
         <w:t>Canto (o dima)</w:t>
       </w:r>
       <w:r>
@@ -8655,6 +8812,7 @@
           <w:bCs/>
           <w:lang w:eastAsia="es-CO"/>
         </w:rPr>
+        <w:lastRenderedPageBreak/>
         <w:t>Enfranque</w:t>
       </w:r>
       <w:r>
@@ -9404,7 +9562,7 @@
       <w:pPr>
         <w:pStyle w:val="Ttulo2"/>
       </w:pPr>
-      <w:bookmarkStart w:id="7" w:name="_Toc201335701"/>
+      <w:bookmarkStart w:id="7" w:name="_Toc201852692"/>
       <w:r>
         <w:t>Dimensiones de la horma</w:t>
       </w:r>
@@ -10299,7 +10457,7 @@
       <w:pPr>
         <w:pStyle w:val="Ttulo2"/>
       </w:pPr>
-      <w:bookmarkStart w:id="8" w:name="_Toc201335702"/>
+      <w:bookmarkStart w:id="8" w:name="_Toc201852693"/>
       <w:r>
         <w:lastRenderedPageBreak/>
         <w:t>Clasificación de las hormas</w:t>
@@ -10555,6 +10713,12 @@
           <w:lang w:val="es-419" w:eastAsia="es-CO"/>
         </w:rPr>
         <w:t>: proporciona soporte específico en el arco, estabilidad y comodidad para pies con requerimientos especiales</w:t>
+      </w:r>
+      <w:r>
+        <w:rPr>
+          <w:lang w:val="es-419" w:eastAsia="es-CO"/>
+        </w:rPr>
+        <w:t>.</w:t>
       </w:r>
     </w:p>
     <w:p>
@@ -11640,7 +11804,7 @@
       <w:pPr>
         <w:pStyle w:val="Ttulo1"/>
       </w:pPr>
-      <w:bookmarkStart w:id="9" w:name="_Toc201335703"/>
+      <w:bookmarkStart w:id="9" w:name="_Toc201852694"/>
       <w:r>
         <w:lastRenderedPageBreak/>
         <w:t>Relación entre la anatomía del calzado y el pie</w:t>
@@ -11758,7 +11922,7 @@
       <w:pPr>
         <w:pStyle w:val="Ttulo2"/>
       </w:pPr>
-      <w:bookmarkStart w:id="10" w:name="_Toc201335704"/>
+      <w:bookmarkStart w:id="10" w:name="_Toc201852695"/>
       <w:r>
         <w:t>Clasificación según la forma del pie</w:t>
       </w:r>
@@ -11840,7 +12004,7 @@
           <w:noProof/>
         </w:rPr>
         <w:drawing>
-          <wp:inline distT="0" distB="0" distL="0" distR="0" wp14:anchorId="28C29F83" wp14:editId="4A904FEC">
+          <wp:inline distT="0" distB="0" distL="0" distR="0" wp14:anchorId="28C29F83" wp14:editId="57E8D285">
             <wp:extent cx="4572000" cy="2571632"/>
             <wp:effectExtent l="0" t="0" r="0" b="635"/>
             <wp:docPr id="17" name="Imagen 17">
@@ -12004,7 +12168,7 @@
       <w:pPr>
         <w:pStyle w:val="Ttulo2"/>
       </w:pPr>
-      <w:bookmarkStart w:id="11" w:name="_Toc201335705"/>
+      <w:bookmarkStart w:id="11" w:name="_Toc201852696"/>
       <w:r>
         <w:t>Clasificación según el tipo de arco plantar</w:t>
       </w:r>
@@ -12144,7 +12308,7 @@
       <w:pPr>
         <w:pStyle w:val="Ttulo2"/>
       </w:pPr>
-      <w:bookmarkStart w:id="12" w:name="_Toc201335706"/>
+      <w:bookmarkStart w:id="12" w:name="_Toc201852697"/>
       <w:r>
         <w:t>Clasificación según la pisad</w:t>
       </w:r>
@@ -12274,7 +12438,7 @@
       <w:pPr>
         <w:pStyle w:val="Ttulo1"/>
       </w:pPr>
-      <w:bookmarkStart w:id="13" w:name="_Toc201335707"/>
+      <w:bookmarkStart w:id="13" w:name="_Toc201852698"/>
       <w:r>
         <w:lastRenderedPageBreak/>
         <w:t>Herramientas utilizadas en el proceso de patronaje</w:t>
@@ -12596,7 +12760,7 @@
       <w:pPr>
         <w:pStyle w:val="Ttulo1"/>
       </w:pPr>
-      <w:bookmarkStart w:id="14" w:name="_Toc201335708"/>
+      <w:bookmarkStart w:id="14" w:name="_Toc201852699"/>
       <w:r>
         <w:lastRenderedPageBreak/>
         <w:t>Proceso de enmascarado de la horma</w:t>
@@ -12632,7 +12796,6 @@
     </w:p>
     <w:p>
       <w:pPr>
-        <w:ind w:firstLine="0"/>
         <w:jc w:val="center"/>
         <w:rPr>
           <w:lang w:val="es-419" w:eastAsia="es-CO"/>
@@ -12643,10 +12806,10 @@
           <w:noProof/>
         </w:rPr>
         <w:drawing>
-          <wp:inline distT="0" distB="0" distL="0" distR="0" wp14:anchorId="16D2C579" wp14:editId="13857C27">
-            <wp:extent cx="6121793" cy="2604770"/>
+          <wp:inline distT="0" distB="0" distL="0" distR="0" wp14:anchorId="405F474D" wp14:editId="248B03A7">
+            <wp:extent cx="5334000" cy="2483210"/>
             <wp:effectExtent l="0" t="0" r="0" b="0"/>
-            <wp:docPr id="20" name="Imagen 20" descr="Marcación del centro en la punta y el talón de la horma usando una regla como guía."/>
+            <wp:docPr id="779553398" name="Imagen 5" descr="Marcación del centro en la punta y el talón de la horma usando una regla como guía."/>
             <wp:cNvGraphicFramePr>
               <a:graphicFrameLocks xmlns:a="http://schemas.openxmlformats.org/drawingml/2006/main" noChangeAspect="1"/>
             </wp:cNvGraphicFramePr>
@@ -12654,7 +12817,7 @@
               <a:graphicData uri="http://schemas.openxmlformats.org/drawingml/2006/picture">
                 <pic:pic xmlns:pic="http://schemas.openxmlformats.org/drawingml/2006/picture">
                   <pic:nvPicPr>
-                    <pic:cNvPr id="0" name="Picture 30" descr="Marcación del centro en la punta y el talón de la horma usando una regla como guía."/>
+                    <pic:cNvPr id="0" name="Picture 5" descr="Marcación del centro en la punta y el talón de la horma usando una regla como guía."/>
                     <pic:cNvPicPr>
                       <a:picLocks noChangeAspect="1" noChangeArrowheads="1"/>
                     </pic:cNvPicPr>
@@ -12675,7 +12838,7 @@
                   <pic:spPr bwMode="auto">
                     <a:xfrm>
                       <a:off x="0" y="0"/>
-                      <a:ext cx="6127355" cy="2607137"/>
+                      <a:ext cx="5348235" cy="2489837"/>
                     </a:xfrm>
                     <a:prstGeom prst="rect">
                       <a:avLst/>
@@ -13034,13 +13197,7 @@
         <w:rPr>
           <w:lang w:val="es-419" w:eastAsia="es-CO"/>
         </w:rPr>
-        <w:t>el proceso</w:t>
-      </w:r>
-      <w:r>
-        <w:rPr>
-          <w:lang w:val="es-419" w:eastAsia="es-CO"/>
-        </w:rPr>
-        <w:t xml:space="preserve"> de e</w:t>
+        <w:t>el proceso de e</w:t>
       </w:r>
       <w:r>
         <w:rPr>
@@ -13188,13 +13345,7 @@
         <w:rPr>
           <w:lang w:val="es-419" w:eastAsia="es-CO"/>
         </w:rPr>
-        <w:t>el proceso</w:t>
-      </w:r>
-      <w:r>
-        <w:rPr>
-          <w:lang w:val="es-419" w:eastAsia="es-CO"/>
-        </w:rPr>
-        <w:t xml:space="preserve"> de a</w:t>
+        <w:t>el proceso de a</w:t>
       </w:r>
       <w:r>
         <w:rPr>
@@ -13419,13 +13570,7 @@
         <w:rPr>
           <w:lang w:val="es-419" w:eastAsia="es-CO"/>
         </w:rPr>
-        <w:t>el proceso</w:t>
-      </w:r>
-      <w:r>
-        <w:rPr>
-          <w:lang w:val="es-419" w:eastAsia="es-CO"/>
-        </w:rPr>
-        <w:t xml:space="preserve"> de la t</w:t>
+        <w:t>el proceso de la t</w:t>
       </w:r>
       <w:r>
         <w:rPr>
@@ -13560,13 +13705,7 @@
         <w:rPr>
           <w:lang w:val="es-419" w:eastAsia="es-CO"/>
         </w:rPr>
-        <w:t>el proceso</w:t>
-      </w:r>
-      <w:r>
-        <w:rPr>
-          <w:lang w:val="es-419" w:eastAsia="es-CO"/>
-        </w:rPr>
-        <w:t xml:space="preserve"> de v</w:t>
+        <w:t>el proceso de v</w:t>
       </w:r>
       <w:r>
         <w:rPr>
@@ -13755,7 +13894,7 @@
           <w:lang w:val="es-CO"/>
         </w:rPr>
       </w:pPr>
-      <w:bookmarkStart w:id="15" w:name="_Toc201335709"/>
+      <w:bookmarkStart w:id="15" w:name="_Toc201852700"/>
       <w:r>
         <w:rPr>
           <w:lang w:val="es-CO"/>
@@ -13800,9 +13939,9 @@
           <w:lang w:eastAsia="es-CO"/>
         </w:rPr>
         <w:drawing>
-          <wp:inline distT="0" distB="0" distL="0" distR="0" wp14:anchorId="14C571FD" wp14:editId="35B20F69">
-            <wp:extent cx="6285310" cy="3590925"/>
-            <wp:effectExtent l="0" t="0" r="1270" b="0"/>
+          <wp:inline distT="0" distB="0" distL="0" distR="0" wp14:anchorId="14C571FD" wp14:editId="6AEF579A">
+            <wp:extent cx="6001889" cy="3429000"/>
+            <wp:effectExtent l="0" t="0" r="0" b="0"/>
             <wp:docPr id="1642522531" name="Imagen 4" descr="Diagrama sobre fundamentos del patronaje de calzado que organiza temas como sistemas de medidas, hormas, relación entre la anatomía del calzado y el pie, herramientas del patronaje y proceso de enmascarado. Incluye subtemas como numeración, dimensiones y clasificación de hormas, así como tipos de pie y pisada."/>
             <wp:cNvGraphicFramePr>
               <a:graphicFrameLocks xmlns:a="http://schemas.openxmlformats.org/drawingml/2006/main" noChangeAspect="1"/>
@@ -13832,7 +13971,7 @@
                   <pic:spPr bwMode="auto">
                     <a:xfrm>
                       <a:off x="0" y="0"/>
-                      <a:ext cx="6286984" cy="3591881"/>
+                      <a:ext cx="6008575" cy="3432820"/>
                     </a:xfrm>
                     <a:prstGeom prst="rect">
                       <a:avLst/>
@@ -13879,7 +14018,7 @@
           <w:lang w:val="es-CO"/>
         </w:rPr>
       </w:pPr>
-      <w:bookmarkStart w:id="16" w:name="_Toc201335710"/>
+      <w:bookmarkStart w:id="16" w:name="_Toc201852701"/>
       <w:r>
         <w:rPr>
           <w:lang w:val="es-CO"/>
@@ -14202,7 +14341,7 @@
           <w:lang w:val="es-CO"/>
         </w:rPr>
       </w:pPr>
-      <w:bookmarkStart w:id="17" w:name="_Toc201335711"/>
+      <w:bookmarkStart w:id="17" w:name="_Toc201852702"/>
       <w:r>
         <w:rPr>
           <w:lang w:val="es-CO"/>
@@ -14376,7 +14515,7 @@
           <w:lang w:val="es-CO"/>
         </w:rPr>
       </w:pPr>
-      <w:bookmarkStart w:id="18" w:name="_Toc201335712"/>
+      <w:bookmarkStart w:id="18" w:name="_Toc201852703"/>
       <w:r>
         <w:rPr>
           <w:lang w:val="es-CO"/>
@@ -14526,7 +14665,7 @@
           <w:lang w:val="es-CO"/>
         </w:rPr>
       </w:pPr>
-      <w:bookmarkStart w:id="19" w:name="_Toc201335713"/>
+      <w:bookmarkStart w:id="19" w:name="_Toc201852704"/>
       <w:r>
         <w:rPr>
           <w:lang w:val="es-CO"/>
@@ -25763,10 +25902,6 @@
 </file>
 
 <file path=customXml/item1.xml><?xml version="1.0" encoding="utf-8"?>
-<b:Sources xmlns:b="http://schemas.openxmlformats.org/officeDocument/2006/bibliography" xmlns="http://schemas.openxmlformats.org/officeDocument/2006/bibliography" SelectedStyle="\APASixthEditionOfficeOnline.xsl" StyleName="APA" Version="6"/>
-</file>
-
-<file path=customXml/item2.xml><?xml version="1.0" encoding="utf-8"?>
 <ct:contentTypeSchema xmlns:ct="http://schemas.microsoft.com/office/2006/metadata/contentType" xmlns:ma="http://schemas.microsoft.com/office/2006/metadata/properties/metaAttributes" ct:_="" ma:_="" ma:contentTypeName="Documento" ma:contentTypeID="0x01010049282E1EDBE9234EA9E6D38F720E265F" ma:contentTypeVersion="15" ma:contentTypeDescription="Crear nuevo documento." ma:contentTypeScope="" ma:versionID="b31c7aa9eaf043a08b87120b3c4916e3">
   <xsd:schema xmlns:xsd="http://www.w3.org/2001/XMLSchema" xmlns:xs="http://www.w3.org/2001/XMLSchema" xmlns:p="http://schemas.microsoft.com/office/2006/metadata/properties" xmlns:ns2="cb45339b-ced9-4d0d-8f64-77573914d53b" xmlns:ns3="43a3ca16-9c26-4813-b83f-4aec9927b43f" targetNamespace="http://schemas.microsoft.com/office/2006/metadata/properties" ma:root="true" ma:fieldsID="3533d065b04d75c457075bc55f1f5315" ns2:_="" ns3:_="">
     <xsd:import namespace="cb45339b-ced9-4d0d-8f64-77573914d53b"/>
@@ -26001,7 +26136,20 @@
 </ct:contentTypeSchema>
 </file>
 
+<file path=customXml/item2.xml><?xml version="1.0" encoding="utf-8"?>
+<b:Sources xmlns:b="http://schemas.openxmlformats.org/officeDocument/2006/bibliography" xmlns="http://schemas.openxmlformats.org/officeDocument/2006/bibliography" SelectedStyle="\APASixthEditionOfficeOnline.xsl" StyleName="APA" Version="6"/>
+</file>
+
 <file path=customXml/item3.xml><?xml version="1.0" encoding="utf-8"?>
+<?mso-contentType ?>
+<FormTemplates xmlns="http://schemas.microsoft.com/sharepoint/v3/contenttype/forms">
+  <Display>DocumentLibraryForm</Display>
+  <Edit>DocumentLibraryForm</Edit>
+  <New>DocumentLibraryForm</New>
+</FormTemplates>
+</file>
+
+<file path=customXml/item4.xml><?xml version="1.0" encoding="utf-8"?>
 <p:properties xmlns:p="http://schemas.microsoft.com/office/2006/metadata/properties" xmlns:xsi="http://www.w3.org/2001/XMLSchema-instance" xmlns:pc="http://schemas.microsoft.com/office/infopath/2007/PartnerControls">
   <documentManagement>
     <TaxCatchAll xmlns="cb45339b-ced9-4d0d-8f64-77573914d53b" xsi:nil="true"/>
@@ -26012,24 +26160,7 @@
 </p:properties>
 </file>
 
-<file path=customXml/item4.xml><?xml version="1.0" encoding="utf-8"?>
-<?mso-contentType ?>
-<FormTemplates xmlns="http://schemas.microsoft.com/sharepoint/v3/contenttype/forms">
-  <Display>DocumentLibraryForm</Display>
-  <Edit>DocumentLibraryForm</Edit>
-  <New>DocumentLibraryForm</New>
-</FormTemplates>
-</file>
-
 <file path=customXml/itemProps1.xml><?xml version="1.0" encoding="utf-8"?>
-<ds:datastoreItem xmlns:ds="http://schemas.openxmlformats.org/officeDocument/2006/customXml" ds:itemID="{EAE431FD-7059-4C09-804B-C9D69EB7B213}">
-  <ds:schemaRefs>
-    <ds:schemaRef ds:uri="http://schemas.openxmlformats.org/officeDocument/2006/bibliography"/>
-  </ds:schemaRefs>
-</ds:datastoreItem>
-</file>
-
-<file path=customXml/itemProps2.xml><?xml version="1.0" encoding="utf-8"?>
 <ds:datastoreItem xmlns:ds="http://schemas.openxmlformats.org/officeDocument/2006/customXml" ds:itemID="{ABC43734-40DA-4258-8AC6-EC91AAFFC9CD}">
   <ds:schemaRefs>
     <ds:schemaRef ds:uri="http://schemas.microsoft.com/office/2006/metadata/contentType"/>
@@ -26048,7 +26179,23 @@
 </ds:datastoreItem>
 </file>
 
+<file path=customXml/itemProps2.xml><?xml version="1.0" encoding="utf-8"?>
+<ds:datastoreItem xmlns:ds="http://schemas.openxmlformats.org/officeDocument/2006/customXml" ds:itemID="{EAE431FD-7059-4C09-804B-C9D69EB7B213}">
+  <ds:schemaRefs>
+    <ds:schemaRef ds:uri="http://schemas.openxmlformats.org/officeDocument/2006/bibliography"/>
+  </ds:schemaRefs>
+</ds:datastoreItem>
+</file>
+
 <file path=customXml/itemProps3.xml><?xml version="1.0" encoding="utf-8"?>
+<ds:datastoreItem xmlns:ds="http://schemas.openxmlformats.org/officeDocument/2006/customXml" ds:itemID="{10663269-2064-4804-8290-36D4A57F5557}">
+  <ds:schemaRefs>
+    <ds:schemaRef ds:uri="http://schemas.microsoft.com/sharepoint/v3/contenttype/forms"/>
+  </ds:schemaRefs>
+</ds:datastoreItem>
+</file>
+
+<file path=customXml/itemProps4.xml><?xml version="1.0" encoding="utf-8"?>
 <ds:datastoreItem xmlns:ds="http://schemas.openxmlformats.org/officeDocument/2006/customXml" ds:itemID="{1279454D-02BE-4A9C-A117-DCD1573E2608}">
   <ds:schemaRefs>
     <ds:schemaRef ds:uri="http://schemas.microsoft.com/office/2006/metadata/properties"/>
@@ -26057,12 +26204,4 @@
     <ds:schemaRef ds:uri="43a3ca16-9c26-4813-b83f-4aec9927b43f"/>
   </ds:schemaRefs>
 </ds:datastoreItem>
-</file>
-
-<file path=customXml/itemProps4.xml><?xml version="1.0" encoding="utf-8"?>
-<ds:datastoreItem xmlns:ds="http://schemas.openxmlformats.org/officeDocument/2006/customXml" ds:itemID="{10663269-2064-4804-8290-36D4A57F5557}">
-  <ds:schemaRefs>
-    <ds:schemaRef ds:uri="http://schemas.microsoft.com/sharepoint/v3/contenttype/forms"/>
-  </ds:schemaRefs>
-</ds:datastoreItem>
 </file>
</xml_diff>

<commit_message>
Ajuste PDF - MD
</commit_message>
<xml_diff>
--- a/fuentes/52450481_CF02_DU.docx
+++ b/fuentes/52450481_CF02_DU.docx
@@ -347,7 +347,7 @@
               </wp:anchor>
             </w:drawing>
           </mc:Choice>
-          <mc:Fallback xmlns:asvg="http://schemas.microsoft.com/office/drawing/2016/SVG/main" xmlns:a14="http://schemas.microsoft.com/office/drawing/2010/main" xmlns:pic="http://schemas.openxmlformats.org/drawingml/2006/picture" xmlns:adec="http://schemas.microsoft.com/office/drawing/2017/decorative" xmlns:a="http://schemas.openxmlformats.org/drawingml/2006/main">
+          <mc:Fallback xmlns:a="http://schemas.openxmlformats.org/drawingml/2006/main" xmlns:adec="http://schemas.microsoft.com/office/drawing/2017/decorative" xmlns:pic="http://schemas.openxmlformats.org/drawingml/2006/picture" xmlns:a14="http://schemas.microsoft.com/office/drawing/2010/main" xmlns:asvg="http://schemas.microsoft.com/office/drawing/2016/SVG/main">
             <w:pict>
               <v:rect id="Rectángulo 3" style="position:absolute;margin-left:-55.95pt;margin-top:26.4pt;width:613.85pt;height:164.25pt;z-index:-251655168;visibility:visible;mso-wrap-style:square;mso-height-percent:0;mso-wrap-distance-left:9pt;mso-wrap-distance-top:0;mso-wrap-distance-right:9pt;mso-wrap-distance-bottom:0;mso-position-horizontal:absolute;mso-position-horizontal-relative:text;mso-position-vertical:absolute;mso-position-vertical-relative:text;mso-height-percent:0;mso-height-relative:margin;v-text-anchor:middle" o:spid="_x0000_s1026" fillcolor="#00314d" stroked="f" strokeweight="1pt" w14:anchorId="3617F850" o:gfxdata="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"/>
             </w:pict>
@@ -590,7 +590,7 @@
           <w:r>
             <w:fldChar w:fldCharType="separate"/>
           </w:r>
-          <w:hyperlink w:anchor="_Toc201852685" w:history="1">
+          <w:hyperlink w:anchor="_Toc202361352" w:history="1">
             <w:r>
               <w:rPr>
                 <w:rStyle w:val="Hipervnculo"/>
@@ -617,7 +617,7 @@
                 <w:noProof/>
                 <w:webHidden/>
               </w:rPr>
-              <w:instrText xml:space="preserve"> PAGEREF _Toc201852685 \h </w:instrText>
+              <w:instrText xml:space="preserve"> PAGEREF _Toc202361352 \h </w:instrText>
             </w:r>
             <w:r>
               <w:rPr>
@@ -663,7 +663,7 @@
               <w:lang w:eastAsia="es-CO"/>
             </w:rPr>
           </w:pPr>
-          <w:hyperlink w:anchor="_Toc201852686" w:history="1">
+          <w:hyperlink w:anchor="_Toc202361353" w:history="1">
             <w:r>
               <w:rPr>
                 <w:rStyle w:val="Hipervnculo"/>
@@ -707,7 +707,7 @@
                 <w:noProof/>
                 <w:webHidden/>
               </w:rPr>
-              <w:instrText xml:space="preserve"> PAGEREF _Toc201852686 \h </w:instrText>
+              <w:instrText xml:space="preserve"> PAGEREF _Toc202361353 \h </w:instrText>
             </w:r>
             <w:r>
               <w:rPr>
@@ -753,7 +753,7 @@
               <w:lang w:eastAsia="es-CO"/>
             </w:rPr>
           </w:pPr>
-          <w:hyperlink w:anchor="_Toc201852687" w:history="1">
+          <w:hyperlink w:anchor="_Toc202361354" w:history="1">
             <w:r>
               <w:rPr>
                 <w:rStyle w:val="Hipervnculo"/>
@@ -803,7 +803,7 @@
                 <w:noProof/>
                 <w:webHidden/>
               </w:rPr>
-              <w:instrText xml:space="preserve"> PAGEREF _Toc201852687 \h </w:instrText>
+              <w:instrText xml:space="preserve"> PAGEREF _Toc202361354 \h </w:instrText>
             </w:r>
             <w:r>
               <w:rPr>
@@ -849,7 +849,7 @@
               <w:lang w:eastAsia="es-CO"/>
             </w:rPr>
           </w:pPr>
-          <w:hyperlink w:anchor="_Toc201852688" w:history="1">
+          <w:hyperlink w:anchor="_Toc202361355" w:history="1">
             <w:r>
               <w:rPr>
                 <w:rStyle w:val="Hipervnculo"/>
@@ -899,7 +899,7 @@
                 <w:noProof/>
                 <w:webHidden/>
               </w:rPr>
-              <w:instrText xml:space="preserve"> PAGEREF _Toc201852688 \h </w:instrText>
+              <w:instrText xml:space="preserve"> PAGEREF _Toc202361355 \h </w:instrText>
             </w:r>
             <w:r>
               <w:rPr>
@@ -945,7 +945,7 @@
               <w:lang w:eastAsia="es-CO"/>
             </w:rPr>
           </w:pPr>
-          <w:hyperlink w:anchor="_Toc201852689" w:history="1">
+          <w:hyperlink w:anchor="_Toc202361356" w:history="1">
             <w:r>
               <w:rPr>
                 <w:rStyle w:val="Hipervnculo"/>
@@ -995,7 +995,7 @@
                 <w:noProof/>
                 <w:webHidden/>
               </w:rPr>
-              <w:instrText xml:space="preserve"> PAGEREF _Toc201852689 \h </w:instrText>
+              <w:instrText xml:space="preserve"> PAGEREF _Toc202361356 \h </w:instrText>
             </w:r>
             <w:r>
               <w:rPr>
@@ -1041,7 +1041,7 @@
               <w:lang w:eastAsia="es-CO"/>
             </w:rPr>
           </w:pPr>
-          <w:hyperlink w:anchor="_Toc201852690" w:history="1">
+          <w:hyperlink w:anchor="_Toc202361357" w:history="1">
             <w:r>
               <w:rPr>
                 <w:rStyle w:val="Hipervnculo"/>
@@ -1085,7 +1085,7 @@
                 <w:noProof/>
                 <w:webHidden/>
               </w:rPr>
-              <w:instrText xml:space="preserve"> PAGEREF _Toc201852690 \h </w:instrText>
+              <w:instrText xml:space="preserve"> PAGEREF _Toc202361357 \h </w:instrText>
             </w:r>
             <w:r>
               <w:rPr>
@@ -1131,7 +1131,7 @@
               <w:lang w:eastAsia="es-CO"/>
             </w:rPr>
           </w:pPr>
-          <w:hyperlink w:anchor="_Toc201852691" w:history="1">
+          <w:hyperlink w:anchor="_Toc202361358" w:history="1">
             <w:r>
               <w:rPr>
                 <w:rStyle w:val="Hipervnculo"/>
@@ -1181,7 +1181,7 @@
                 <w:noProof/>
                 <w:webHidden/>
               </w:rPr>
-              <w:instrText xml:space="preserve"> PAGEREF _Toc201852691 \h </w:instrText>
+              <w:instrText xml:space="preserve"> PAGEREF _Toc202361358 \h </w:instrText>
             </w:r>
             <w:r>
               <w:rPr>
@@ -1227,7 +1227,7 @@
               <w:lang w:eastAsia="es-CO"/>
             </w:rPr>
           </w:pPr>
-          <w:hyperlink w:anchor="_Toc201852692" w:history="1">
+          <w:hyperlink w:anchor="_Toc202361359" w:history="1">
             <w:r>
               <w:rPr>
                 <w:rStyle w:val="Hipervnculo"/>
@@ -1277,7 +1277,7 @@
                 <w:noProof/>
                 <w:webHidden/>
               </w:rPr>
-              <w:instrText xml:space="preserve"> PAGEREF _Toc201852692 \h </w:instrText>
+              <w:instrText xml:space="preserve"> PAGEREF _Toc202361359 \h </w:instrText>
             </w:r>
             <w:r>
               <w:rPr>
@@ -1323,7 +1323,7 @@
               <w:lang w:eastAsia="es-CO"/>
             </w:rPr>
           </w:pPr>
-          <w:hyperlink w:anchor="_Toc201852693" w:history="1">
+          <w:hyperlink w:anchor="_Toc202361360" w:history="1">
             <w:r>
               <w:rPr>
                 <w:rStyle w:val="Hipervnculo"/>
@@ -1373,7 +1373,7 @@
                 <w:noProof/>
                 <w:webHidden/>
               </w:rPr>
-              <w:instrText xml:space="preserve"> PAGEREF _Toc201852693 \h </w:instrText>
+              <w:instrText xml:space="preserve"> PAGEREF _Toc202361360 \h </w:instrText>
             </w:r>
             <w:r>
               <w:rPr>
@@ -1419,7 +1419,7 @@
               <w:lang w:eastAsia="es-CO"/>
             </w:rPr>
           </w:pPr>
-          <w:hyperlink w:anchor="_Toc201852694" w:history="1">
+          <w:hyperlink w:anchor="_Toc202361361" w:history="1">
             <w:r>
               <w:rPr>
                 <w:rStyle w:val="Hipervnculo"/>
@@ -1463,7 +1463,7 @@
                 <w:noProof/>
                 <w:webHidden/>
               </w:rPr>
-              <w:instrText xml:space="preserve"> PAGEREF _Toc201852694 \h </w:instrText>
+              <w:instrText xml:space="preserve"> PAGEREF _Toc202361361 \h </w:instrText>
             </w:r>
             <w:r>
               <w:rPr>
@@ -1509,7 +1509,7 @@
               <w:lang w:eastAsia="es-CO"/>
             </w:rPr>
           </w:pPr>
-          <w:hyperlink w:anchor="_Toc201852695" w:history="1">
+          <w:hyperlink w:anchor="_Toc202361362" w:history="1">
             <w:r>
               <w:rPr>
                 <w:rStyle w:val="Hipervnculo"/>
@@ -1559,7 +1559,7 @@
                 <w:noProof/>
                 <w:webHidden/>
               </w:rPr>
-              <w:instrText xml:space="preserve"> PAGEREF _Toc201852695 \h </w:instrText>
+              <w:instrText xml:space="preserve"> PAGEREF _Toc202361362 \h </w:instrText>
             </w:r>
             <w:r>
               <w:rPr>
@@ -1605,7 +1605,7 @@
               <w:lang w:eastAsia="es-CO"/>
             </w:rPr>
           </w:pPr>
-          <w:hyperlink w:anchor="_Toc201852696" w:history="1">
+          <w:hyperlink w:anchor="_Toc202361363" w:history="1">
             <w:r>
               <w:rPr>
                 <w:rStyle w:val="Hipervnculo"/>
@@ -1655,7 +1655,7 @@
                 <w:noProof/>
                 <w:webHidden/>
               </w:rPr>
-              <w:instrText xml:space="preserve"> PAGEREF _Toc201852696 \h </w:instrText>
+              <w:instrText xml:space="preserve"> PAGEREF _Toc202361363 \h </w:instrText>
             </w:r>
             <w:r>
               <w:rPr>
@@ -1701,7 +1701,7 @@
               <w:lang w:eastAsia="es-CO"/>
             </w:rPr>
           </w:pPr>
-          <w:hyperlink w:anchor="_Toc201852697" w:history="1">
+          <w:hyperlink w:anchor="_Toc202361364" w:history="1">
             <w:r>
               <w:rPr>
                 <w:rStyle w:val="Hipervnculo"/>
@@ -1751,7 +1751,7 @@
                 <w:noProof/>
                 <w:webHidden/>
               </w:rPr>
-              <w:instrText xml:space="preserve"> PAGEREF _Toc201852697 \h </w:instrText>
+              <w:instrText xml:space="preserve"> PAGEREF _Toc202361364 \h </w:instrText>
             </w:r>
             <w:r>
               <w:rPr>
@@ -1797,7 +1797,7 @@
               <w:lang w:eastAsia="es-CO"/>
             </w:rPr>
           </w:pPr>
-          <w:hyperlink w:anchor="_Toc201852698" w:history="1">
+          <w:hyperlink w:anchor="_Toc202361365" w:history="1">
             <w:r>
               <w:rPr>
                 <w:rStyle w:val="Hipervnculo"/>
@@ -1841,7 +1841,7 @@
                 <w:noProof/>
                 <w:webHidden/>
               </w:rPr>
-              <w:instrText xml:space="preserve"> PAGEREF _Toc201852698 \h </w:instrText>
+              <w:instrText xml:space="preserve"> PAGEREF _Toc202361365 \h </w:instrText>
             </w:r>
             <w:r>
               <w:rPr>
@@ -1887,7 +1887,7 @@
               <w:lang w:eastAsia="es-CO"/>
             </w:rPr>
           </w:pPr>
-          <w:hyperlink w:anchor="_Toc201852699" w:history="1">
+          <w:hyperlink w:anchor="_Toc202361366" w:history="1">
             <w:r>
               <w:rPr>
                 <w:rStyle w:val="Hipervnculo"/>
@@ -1931,7 +1931,7 @@
                 <w:noProof/>
                 <w:webHidden/>
               </w:rPr>
-              <w:instrText xml:space="preserve"> PAGEREF _Toc201852699 \h </w:instrText>
+              <w:instrText xml:space="preserve"> PAGEREF _Toc202361366 \h </w:instrText>
             </w:r>
             <w:r>
               <w:rPr>
@@ -1976,7 +1976,7 @@
               <w:lang w:eastAsia="es-CO"/>
             </w:rPr>
           </w:pPr>
-          <w:hyperlink w:anchor="_Toc201852700" w:history="1">
+          <w:hyperlink w:anchor="_Toc202361367" w:history="1">
             <w:r>
               <w:rPr>
                 <w:rStyle w:val="Hipervnculo"/>
@@ -2003,7 +2003,7 @@
                 <w:noProof/>
                 <w:webHidden/>
               </w:rPr>
-              <w:instrText xml:space="preserve"> PAGEREF _Toc201852700 \h </w:instrText>
+              <w:instrText xml:space="preserve"> PAGEREF _Toc202361367 \h </w:instrText>
             </w:r>
             <w:r>
               <w:rPr>
@@ -2023,7 +2023,7 @@
                 <w:noProof/>
                 <w:webHidden/>
               </w:rPr>
-              <w:t>41</w:t>
+              <w:t>42</w:t>
             </w:r>
             <w:r>
               <w:rPr>
@@ -2048,7 +2048,7 @@
               <w:lang w:eastAsia="es-CO"/>
             </w:rPr>
           </w:pPr>
-          <w:hyperlink w:anchor="_Toc201852701" w:history="1">
+          <w:hyperlink w:anchor="_Toc202361368" w:history="1">
             <w:r>
               <w:rPr>
                 <w:rStyle w:val="Hipervnculo"/>
@@ -2075,7 +2075,7 @@
                 <w:noProof/>
                 <w:webHidden/>
               </w:rPr>
-              <w:instrText xml:space="preserve"> PAGEREF _Toc201852701 \h </w:instrText>
+              <w:instrText xml:space="preserve"> PAGEREF _Toc202361368 \h </w:instrText>
             </w:r>
             <w:r>
               <w:rPr>
@@ -2095,7 +2095,7 @@
                 <w:noProof/>
                 <w:webHidden/>
               </w:rPr>
-              <w:t>42</w:t>
+              <w:t>43</w:t>
             </w:r>
             <w:r>
               <w:rPr>
@@ -2120,7 +2120,7 @@
               <w:lang w:eastAsia="es-CO"/>
             </w:rPr>
           </w:pPr>
-          <w:hyperlink w:anchor="_Toc201852702" w:history="1">
+          <w:hyperlink w:anchor="_Toc202361369" w:history="1">
             <w:r>
               <w:rPr>
                 <w:rStyle w:val="Hipervnculo"/>
@@ -2147,7 +2147,7 @@
                 <w:noProof/>
                 <w:webHidden/>
               </w:rPr>
-              <w:instrText xml:space="preserve"> PAGEREF _Toc201852702 \h </w:instrText>
+              <w:instrText xml:space="preserve"> PAGEREF _Toc202361369 \h </w:instrText>
             </w:r>
             <w:r>
               <w:rPr>
@@ -2167,7 +2167,7 @@
                 <w:noProof/>
                 <w:webHidden/>
               </w:rPr>
-              <w:t>43</w:t>
+              <w:t>44</w:t>
             </w:r>
             <w:r>
               <w:rPr>
@@ -2192,7 +2192,7 @@
               <w:lang w:eastAsia="es-CO"/>
             </w:rPr>
           </w:pPr>
-          <w:hyperlink w:anchor="_Toc201852703" w:history="1">
+          <w:hyperlink w:anchor="_Toc202361370" w:history="1">
             <w:r>
               <w:rPr>
                 <w:rStyle w:val="Hipervnculo"/>
@@ -2219,7 +2219,7 @@
                 <w:noProof/>
                 <w:webHidden/>
               </w:rPr>
-              <w:instrText xml:space="preserve"> PAGEREF _Toc201852703 \h </w:instrText>
+              <w:instrText xml:space="preserve"> PAGEREF _Toc202361370 \h </w:instrText>
             </w:r>
             <w:r>
               <w:rPr>
@@ -2239,7 +2239,7 @@
                 <w:noProof/>
                 <w:webHidden/>
               </w:rPr>
-              <w:t>44</w:t>
+              <w:t>45</w:t>
             </w:r>
             <w:r>
               <w:rPr>
@@ -2264,7 +2264,7 @@
               <w:lang w:eastAsia="es-CO"/>
             </w:rPr>
           </w:pPr>
-          <w:hyperlink w:anchor="_Toc201852704" w:history="1">
+          <w:hyperlink w:anchor="_Toc202361371" w:history="1">
             <w:r>
               <w:rPr>
                 <w:rStyle w:val="Hipervnculo"/>
@@ -2291,7 +2291,7 @@
                 <w:noProof/>
                 <w:webHidden/>
               </w:rPr>
-              <w:instrText xml:space="preserve"> PAGEREF _Toc201852704 \h </w:instrText>
+              <w:instrText xml:space="preserve"> PAGEREF _Toc202361371 \h </w:instrText>
             </w:r>
             <w:r>
               <w:rPr>
@@ -2311,7 +2311,7 @@
                 <w:noProof/>
                 <w:webHidden/>
               </w:rPr>
-              <w:t>45</w:t>
+              <w:t>46</w:t>
             </w:r>
             <w:r>
               <w:rPr>
@@ -2333,7 +2333,7 @@
       <w:pPr>
         <w:pStyle w:val="Titulosgenerales"/>
       </w:pPr>
-      <w:bookmarkStart w:id="0" w:name="_Toc201852685"/>
+      <w:bookmarkStart w:id="0" w:name="_Toc202361352"/>
       <w:r>
         <w:lastRenderedPageBreak/>
         <w:t>Introducción</w:t>
@@ -2371,7 +2371,7 @@
           <w:lang w:val="es-CO"/>
         </w:rPr>
       </w:pPr>
-      <w:bookmarkStart w:id="1" w:name="_Toc201852686"/>
+      <w:bookmarkStart w:id="1" w:name="_Toc202361353"/>
       <w:r>
         <w:rPr>
           <w:lang w:val="es-CO"/>
@@ -2565,7 +2565,7 @@
       <w:pPr>
         <w:pStyle w:val="Ttulo2"/>
       </w:pPr>
-      <w:bookmarkStart w:id="2" w:name="_Toc201852687"/>
+      <w:bookmarkStart w:id="2" w:name="_Toc202361354"/>
       <w:r>
         <w:t>Principales sistemas de numeración de calzado</w:t>
       </w:r>
@@ -3215,7 +3215,7 @@
       <w:pPr>
         <w:pStyle w:val="Ttulo2"/>
       </w:pPr>
-      <w:bookmarkStart w:id="3" w:name="_Toc201852688"/>
+      <w:bookmarkStart w:id="3" w:name="_Toc202361355"/>
       <w:r>
         <w:t>Conversión básica entre sistemas</w:t>
       </w:r>
@@ -4680,7 +4680,7 @@
       <w:pPr>
         <w:pStyle w:val="Ttulo2"/>
       </w:pPr>
-      <w:bookmarkStart w:id="4" w:name="_Toc201852689"/>
+      <w:bookmarkStart w:id="4" w:name="_Toc202361356"/>
       <w:r>
         <w:t>Medida de ancho o volumen del pie</w:t>
       </w:r>
@@ -4731,7 +4731,6 @@
     </w:p>
     <w:p>
       <w:pPr>
-        <w:ind w:firstLine="0"/>
         <w:jc w:val="center"/>
         <w:rPr>
           <w:lang w:eastAsia="es-CO"/>
@@ -4743,10 +4742,10 @@
           <w:lang w:eastAsia="es-CO"/>
         </w:rPr>
         <w:drawing>
-          <wp:inline distT="0" distB="0" distL="0" distR="0" wp14:anchorId="548892F8" wp14:editId="3E54EBF0">
-            <wp:extent cx="5057775" cy="2199209"/>
-            <wp:effectExtent l="0" t="0" r="0" b="0"/>
-            <wp:docPr id="1" name="Gráfico 1" descr="Diagrama del contorno de un pie con líneas y flechas que indican tres zonas: metatarsos (zona delantera), empeine (zona media elevada) y entrada (zona trasera donde el pie entra al calzado). "/>
+          <wp:inline distT="0" distB="0" distL="0" distR="0" wp14:anchorId="582A6B1F" wp14:editId="2918CF4A">
+            <wp:extent cx="5060315" cy="2200910"/>
+            <wp:effectExtent l="0" t="0" r="6985" b="0"/>
+            <wp:docPr id="292421019" name="Imagen 3" descr="Diagrama del contorno de un pie con líneas y flechas que indican tres zonas: metatarsos (zona delantera), empeine (zona media elevada) y entrada (zona trasera donde el pie entra al calzado)."/>
             <wp:cNvGraphicFramePr>
               <a:graphicFrameLocks xmlns:a="http://schemas.openxmlformats.org/drawingml/2006/main" noChangeAspect="1"/>
             </wp:cNvGraphicFramePr>
@@ -4754,29 +4753,33 @@
               <a:graphicData uri="http://schemas.openxmlformats.org/drawingml/2006/picture">
                 <pic:pic xmlns:pic="http://schemas.openxmlformats.org/drawingml/2006/picture">
                   <pic:nvPicPr>
-                    <pic:cNvPr id="1" name="Gráfico 1" descr="Diagrama del contorno de un pie con líneas y flechas que indican tres zonas: metatarsos (zona delantera), empeine (zona media elevada) y entrada (zona trasera donde el pie entra al calzado). "/>
-                    <pic:cNvPicPr/>
+                    <pic:cNvPr id="292421019" name="Imagen 3" descr="Diagrama del contorno de un pie con líneas y flechas que indican tres zonas: metatarsos (zona delantera), empeine (zona media elevada) y entrada (zona trasera donde el pie entra al calzado)."/>
+                    <pic:cNvPicPr>
+                      <a:picLocks noChangeAspect="1" noChangeArrowheads="1"/>
+                    </pic:cNvPicPr>
                   </pic:nvPicPr>
                   <pic:blipFill>
                     <a:blip r:embed="rId12">
                       <a:extLst>
-                        <a:ext uri="{96DAC541-7B7A-43D3-8B79-37D633B846F1}">
-                          <asvg:svgBlip xmlns:asvg="http://schemas.microsoft.com/office/drawing/2016/SVG/main" r:embed="rId13"/>
+                        <a:ext uri="{28A0092B-C50C-407E-A947-70E740481C1C}">
+                          <a14:useLocalDpi xmlns:a14="http://schemas.microsoft.com/office/drawing/2010/main" val="0"/>
                         </a:ext>
                       </a:extLst>
                     </a:blip>
+                    <a:srcRect/>
                     <a:stretch>
                       <a:fillRect/>
                     </a:stretch>
                   </pic:blipFill>
-                  <pic:spPr>
+                  <pic:spPr bwMode="auto">
                     <a:xfrm>
                       <a:off x="0" y="0"/>
-                      <a:ext cx="5122148" cy="2227200"/>
+                      <a:ext cx="5060315" cy="2200910"/>
                     </a:xfrm>
                     <a:prstGeom prst="rect">
                       <a:avLst/>
                     </a:prstGeom>
+                    <a:noFill/>
                   </pic:spPr>
                 </pic:pic>
               </a:graphicData>
@@ -7912,7 +7915,7 @@
       <w:pPr>
         <w:pStyle w:val="Ttulo1"/>
       </w:pPr>
-      <w:bookmarkStart w:id="5" w:name="_Toc201852690"/>
+      <w:bookmarkStart w:id="5" w:name="_Toc202361357"/>
       <w:r>
         <w:lastRenderedPageBreak/>
         <w:t>Hormas</w:t>
@@ -7936,7 +7939,7 @@
       <w:pPr>
         <w:pStyle w:val="Ttulo2"/>
       </w:pPr>
-      <w:bookmarkStart w:id="6" w:name="_Toc201852691"/>
+      <w:bookmarkStart w:id="6" w:name="_Toc202361358"/>
       <w:r>
         <w:t>Partes de la horma</w:t>
       </w:r>
@@ -8052,7 +8055,7 @@
                     </pic:cNvPicPr>
                   </pic:nvPicPr>
                   <pic:blipFill>
-                    <a:blip r:embed="rId14">
+                    <a:blip r:embed="rId13">
                       <a:extLst>
                         <a:ext uri="{28A0092B-C50C-407E-A947-70E740481C1C}">
                           <a14:useLocalDpi xmlns:a14="http://schemas.microsoft.com/office/drawing/2010/main" val="0"/>
@@ -8217,7 +8220,7 @@
                     </pic:cNvPicPr>
                   </pic:nvPicPr>
                   <pic:blipFill>
-                    <a:blip r:embed="rId15">
+                    <a:blip r:embed="rId14">
                       <a:extLst>
                         <a:ext uri="{28A0092B-C50C-407E-A947-70E740481C1C}">
                           <a14:useLocalDpi xmlns:a14="http://schemas.microsoft.com/office/drawing/2010/main" val="0"/>
@@ -8498,7 +8501,7 @@
                     </pic:cNvPicPr>
                   </pic:nvPicPr>
                   <pic:blipFill>
-                    <a:blip r:embed="rId16">
+                    <a:blip r:embed="rId15">
                       <a:extLst>
                         <a:ext uri="{28A0092B-C50C-407E-A947-70E740481C1C}">
                           <a14:useLocalDpi xmlns:a14="http://schemas.microsoft.com/office/drawing/2010/main" val="0"/>
@@ -8678,7 +8681,7 @@
                     </pic:cNvPicPr>
                   </pic:nvPicPr>
                   <pic:blipFill>
-                    <a:blip r:embed="rId17">
+                    <a:blip r:embed="rId16">
                       <a:extLst>
                         <a:ext uri="{28A0092B-C50C-407E-A947-70E740481C1C}">
                           <a14:useLocalDpi xmlns:a14="http://schemas.microsoft.com/office/drawing/2010/main" val="0"/>
@@ -8916,7 +8919,7 @@
                     </pic:cNvPicPr>
                   </pic:nvPicPr>
                   <pic:blipFill>
-                    <a:blip r:embed="rId18">
+                    <a:blip r:embed="rId17">
                       <a:extLst>
                         <a:ext uri="{28A0092B-C50C-407E-A947-70E740481C1C}">
                           <a14:useLocalDpi xmlns:a14="http://schemas.microsoft.com/office/drawing/2010/main" val="0"/>
@@ -9250,7 +9253,7 @@
                     </pic:cNvPicPr>
                   </pic:nvPicPr>
                   <pic:blipFill>
-                    <a:blip r:embed="rId19">
+                    <a:blip r:embed="rId18">
                       <a:extLst>
                         <a:ext uri="{28A0092B-C50C-407E-A947-70E740481C1C}">
                           <a14:useLocalDpi xmlns:a14="http://schemas.microsoft.com/office/drawing/2010/main" val="0"/>
@@ -9511,7 +9514,7 @@
                     </pic:cNvPicPr>
                   </pic:nvPicPr>
                   <pic:blipFill>
-                    <a:blip r:embed="rId20">
+                    <a:blip r:embed="rId19">
                       <a:extLst>
                         <a:ext uri="{28A0092B-C50C-407E-A947-70E740481C1C}">
                           <a14:useLocalDpi xmlns:a14="http://schemas.microsoft.com/office/drawing/2010/main" val="0"/>
@@ -9562,7 +9565,7 @@
       <w:pPr>
         <w:pStyle w:val="Ttulo2"/>
       </w:pPr>
-      <w:bookmarkStart w:id="7" w:name="_Toc201852692"/>
+      <w:bookmarkStart w:id="7" w:name="_Toc202361359"/>
       <w:r>
         <w:t>Dimensiones de la horma</w:t>
       </w:r>
@@ -9931,7 +9934,7 @@
                     </pic:cNvPicPr>
                   </pic:nvPicPr>
                   <pic:blipFill>
-                    <a:blip r:embed="rId21">
+                    <a:blip r:embed="rId20">
                       <a:extLst>
                         <a:ext uri="{28A0092B-C50C-407E-A947-70E740481C1C}">
                           <a14:useLocalDpi xmlns:a14="http://schemas.microsoft.com/office/drawing/2010/main" val="0"/>
@@ -10131,7 +10134,7 @@
                     </pic:cNvPicPr>
                   </pic:nvPicPr>
                   <pic:blipFill>
-                    <a:blip r:embed="rId22">
+                    <a:blip r:embed="rId21">
                       <a:extLst>
                         <a:ext uri="{28A0092B-C50C-407E-A947-70E740481C1C}">
                           <a14:useLocalDpi xmlns:a14="http://schemas.microsoft.com/office/drawing/2010/main" val="0"/>
@@ -10406,7 +10409,7 @@
                     </pic:cNvPicPr>
                   </pic:nvPicPr>
                   <pic:blipFill>
-                    <a:blip r:embed="rId23">
+                    <a:blip r:embed="rId22">
                       <a:extLst>
                         <a:ext uri="{28A0092B-C50C-407E-A947-70E740481C1C}">
                           <a14:useLocalDpi xmlns:a14="http://schemas.microsoft.com/office/drawing/2010/main" val="0"/>
@@ -10457,7 +10460,7 @@
       <w:pPr>
         <w:pStyle w:val="Ttulo2"/>
       </w:pPr>
-      <w:bookmarkStart w:id="8" w:name="_Toc201852693"/>
+      <w:bookmarkStart w:id="8" w:name="_Toc202361360"/>
       <w:r>
         <w:lastRenderedPageBreak/>
         <w:t>Clasificación de las hormas</w:t>
@@ -11753,7 +11756,7 @@
                     </pic:cNvPicPr>
                   </pic:nvPicPr>
                   <pic:blipFill>
-                    <a:blip r:embed="rId24">
+                    <a:blip r:embed="rId23">
                       <a:extLst>
                         <a:ext uri="{28A0092B-C50C-407E-A947-70E740481C1C}">
                           <a14:useLocalDpi xmlns:a14="http://schemas.microsoft.com/office/drawing/2010/main" val="0"/>
@@ -11804,7 +11807,7 @@
       <w:pPr>
         <w:pStyle w:val="Ttulo1"/>
       </w:pPr>
-      <w:bookmarkStart w:id="9" w:name="_Toc201852694"/>
+      <w:bookmarkStart w:id="9" w:name="_Toc202361361"/>
       <w:r>
         <w:lastRenderedPageBreak/>
         <w:t>Relación entre la anatomía del calzado y el pie</w:t>
@@ -11922,7 +11925,7 @@
       <w:pPr>
         <w:pStyle w:val="Ttulo2"/>
       </w:pPr>
-      <w:bookmarkStart w:id="10" w:name="_Toc201852695"/>
+      <w:bookmarkStart w:id="10" w:name="_Toc202361362"/>
       <w:r>
         <w:t>Clasificación según la forma del pie</w:t>
       </w:r>
@@ -12004,7 +12007,7 @@
           <w:noProof/>
         </w:rPr>
         <w:drawing>
-          <wp:inline distT="0" distB="0" distL="0" distR="0" wp14:anchorId="28C29F83" wp14:editId="57E8D285">
+          <wp:inline distT="0" distB="0" distL="0" distR="0" wp14:anchorId="28C29F83" wp14:editId="023EF621">
             <wp:extent cx="4572000" cy="2571632"/>
             <wp:effectExtent l="0" t="0" r="0" b="635"/>
             <wp:docPr id="17" name="Imagen 17">
@@ -12033,7 +12036,7 @@
                     </pic:cNvPicPr>
                   </pic:nvPicPr>
                   <pic:blipFill>
-                    <a:blip r:embed="rId25" cstate="print">
+                    <a:blip r:embed="rId24" cstate="print">
                       <a:extLst>
                         <a:ext uri="{28A0092B-C50C-407E-A947-70E740481C1C}">
                           <a14:useLocalDpi xmlns:a14="http://schemas.microsoft.com/office/drawing/2010/main" val="0"/>
@@ -12076,7 +12079,7 @@
           <w:iCs/>
         </w:rPr>
       </w:pPr>
-      <w:hyperlink r:id="rId26" w:history="1">
+      <w:hyperlink r:id="rId25" w:history="1">
         <w:r>
           <w:rPr>
             <w:rStyle w:val="Hipervnculo"/>
@@ -12168,8 +12171,9 @@
       <w:pPr>
         <w:pStyle w:val="Ttulo2"/>
       </w:pPr>
-      <w:bookmarkStart w:id="11" w:name="_Toc201852696"/>
-      <w:r>
+      <w:bookmarkStart w:id="11" w:name="_Toc202361363"/>
+      <w:r>
+        <w:lastRenderedPageBreak/>
         <w:t>Clasificación según el tipo de arco plantar</w:t>
       </w:r>
       <w:bookmarkEnd w:id="11"/>
@@ -12308,7 +12312,7 @@
       <w:pPr>
         <w:pStyle w:val="Ttulo2"/>
       </w:pPr>
-      <w:bookmarkStart w:id="12" w:name="_Toc201852697"/>
+      <w:bookmarkStart w:id="12" w:name="_Toc202361364"/>
       <w:r>
         <w:t>Clasificación según la pisad</w:t>
       </w:r>
@@ -12438,7 +12442,7 @@
       <w:pPr>
         <w:pStyle w:val="Ttulo1"/>
       </w:pPr>
-      <w:bookmarkStart w:id="13" w:name="_Toc201852698"/>
+      <w:bookmarkStart w:id="13" w:name="_Toc202361365"/>
       <w:r>
         <w:lastRenderedPageBreak/>
         <w:t>Herramientas utilizadas en el proceso de patronaje</w:t>
@@ -12500,7 +12504,7 @@
                     <pic:cNvPicPr/>
                   </pic:nvPicPr>
                   <pic:blipFill>
-                    <a:blip r:embed="rId27"/>
+                    <a:blip r:embed="rId26"/>
                     <a:stretch>
                       <a:fillRect/>
                     </a:stretch>
@@ -12760,7 +12764,7 @@
       <w:pPr>
         <w:pStyle w:val="Ttulo1"/>
       </w:pPr>
-      <w:bookmarkStart w:id="14" w:name="_Toc201852699"/>
+      <w:bookmarkStart w:id="14" w:name="_Toc202361366"/>
       <w:r>
         <w:lastRenderedPageBreak/>
         <w:t>Proceso de enmascarado de la horma</w:t>
@@ -12823,7 +12827,7 @@
                     </pic:cNvPicPr>
                   </pic:nvPicPr>
                   <pic:blipFill>
-                    <a:blip r:embed="rId28">
+                    <a:blip r:embed="rId27">
                       <a:extLst>
                         <a:ext uri="{28A0092B-C50C-407E-A947-70E740481C1C}">
                           <a14:useLocalDpi xmlns:a14="http://schemas.microsoft.com/office/drawing/2010/main" val="0"/>
@@ -12958,7 +12962,6 @@
     </w:p>
     <w:p>
       <w:pPr>
-        <w:ind w:firstLine="0"/>
         <w:jc w:val="center"/>
         <w:rPr>
           <w:lang w:val="es-419" w:eastAsia="es-CO"/>
@@ -12969,10 +12972,10 @@
           <w:noProof/>
         </w:rPr>
         <w:drawing>
-          <wp:inline distT="0" distB="0" distL="0" distR="0" wp14:anchorId="5B6C9A0E" wp14:editId="1214F84B">
-            <wp:extent cx="6067425" cy="2314575"/>
-            <wp:effectExtent l="0" t="0" r="9525" b="9525"/>
-            <wp:docPr id="21" name="Imagen 21" descr="Colocación de una tira de cinta de enmascarar desde el centro del talón hasta la punta del empeine para iniciar el proceso de enmascarado. "/>
+          <wp:inline distT="0" distB="0" distL="0" distR="0" wp14:anchorId="3FEC0CE2" wp14:editId="42162205">
+            <wp:extent cx="4714875" cy="3200400"/>
+            <wp:effectExtent l="0" t="0" r="9525" b="0"/>
+            <wp:docPr id="8316721" name="Imagen 4" descr="Colocación de una tira de cinta de enmascarar desde el centro del talón hasta la punta del empeine para iniciar el proceso de enmascarado. "/>
             <wp:cNvGraphicFramePr>
               <a:graphicFrameLocks xmlns:a="http://schemas.openxmlformats.org/drawingml/2006/main" noChangeAspect="1"/>
             </wp:cNvGraphicFramePr>
@@ -12980,13 +12983,879 @@
               <a:graphicData uri="http://schemas.openxmlformats.org/drawingml/2006/picture">
                 <pic:pic xmlns:pic="http://schemas.openxmlformats.org/drawingml/2006/picture">
                   <pic:nvPicPr>
-                    <pic:cNvPr id="0" name="Picture 32" descr="Colocación de una tira de cinta de enmascarar desde el centro del talón hasta la punta del empeine para iniciar el proceso de enmascarado. "/>
+                    <pic:cNvPr id="0" name="Picture 2" descr="Colocación de una tira de cinta de enmascarar desde el centro del talón hasta la punta del empeine para iniciar el proceso de enmascarado. "/>
+                    <pic:cNvPicPr>
+                      <a:picLocks noChangeAspect="1" noChangeArrowheads="1"/>
+                    </pic:cNvPicPr>
+                  </pic:nvPicPr>
+                  <pic:blipFill>
+                    <a:blip r:embed="rId28">
+                      <a:extLst>
+                        <a:ext uri="{28A0092B-C50C-407E-A947-70E740481C1C}">
+                          <a14:useLocalDpi xmlns:a14="http://schemas.microsoft.com/office/drawing/2010/main" val="0"/>
+                        </a:ext>
+                      </a:extLst>
+                    </a:blip>
+                    <a:srcRect/>
+                    <a:stretch>
+                      <a:fillRect/>
+                    </a:stretch>
+                  </pic:blipFill>
+                  <pic:spPr bwMode="auto">
+                    <a:xfrm>
+                      <a:off x="0" y="0"/>
+                      <a:ext cx="4714875" cy="3200400"/>
+                    </a:xfrm>
+                    <a:prstGeom prst="rect">
+                      <a:avLst/>
+                    </a:prstGeom>
+                    <a:noFill/>
+                    <a:ln>
+                      <a:noFill/>
+                    </a:ln>
+                  </pic:spPr>
+                </pic:pic>
+              </a:graphicData>
+            </a:graphic>
+          </wp:inline>
+        </w:drawing>
+      </w:r>
+    </w:p>
+    <w:p>
+      <w:pPr>
+        <w:rPr>
+          <w:lang w:val="es-419" w:eastAsia="es-CO"/>
+        </w:rPr>
+      </w:pPr>
+      <w:r>
+        <w:rPr>
+          <w:b/>
+          <w:bCs/>
+          <w:lang w:val="es-419" w:eastAsia="es-CO"/>
+        </w:rPr>
+        <w:t>Nota</w:t>
+      </w:r>
+      <w:r>
+        <w:rPr>
+          <w:lang w:val="es-419" w:eastAsia="es-CO"/>
+        </w:rPr>
+        <w:t>. Es importante mantener siempre visibles los puntos centrales para evitar que se pierdan al colocar la cinta.</w:t>
+      </w:r>
+    </w:p>
+    <w:p>
+      <w:pPr>
+        <w:rPr>
+          <w:lang w:val="es-419" w:eastAsia="es-CO"/>
+        </w:rPr>
+      </w:pPr>
+    </w:p>
+    <w:p>
+      <w:pPr>
+        <w:pStyle w:val="Ttulo4"/>
+      </w:pPr>
+      <w:r>
+        <w:lastRenderedPageBreak/>
+        <w:t>Refuerzo del enmascarado en el empeine y lateral</w:t>
+      </w:r>
+    </w:p>
+    <w:p>
+      <w:pPr>
+        <w:rPr>
+          <w:lang w:val="es-419" w:eastAsia="es-CO"/>
+        </w:rPr>
+      </w:pPr>
+      <w:r>
+        <w:rPr>
+          <w:lang w:val="es-419" w:eastAsia="es-CO"/>
+        </w:rPr>
+        <w:t>A continuación, se coloca una cinta de refuerzo aproximadamente a la altura de la línea de profundidad en ambas caras de la horma. Luego, se aplica otra cinta sobre la línea de plantilla, rodeando el contorno de la horma. Esta debe quedar colocada de modo que una mitad cubra el perfil lateral y la otra se doble hacia la cara plantar.</w:t>
+      </w:r>
+    </w:p>
+    <w:p>
+      <w:pPr>
+        <w:pStyle w:val="Figura"/>
+        <w:rPr>
+          <w:lang w:val="es-419"/>
+        </w:rPr>
+      </w:pPr>
+      <w:r>
+        <w:rPr>
+          <w:lang w:val="es-419"/>
+        </w:rPr>
+        <w:t>Refuerzo del enmascarado en el empeine y lateral</w:t>
+      </w:r>
+    </w:p>
+    <w:p>
+      <w:pPr>
+        <w:jc w:val="center"/>
+        <w:rPr>
+          <w:lang w:val="es-419" w:eastAsia="es-CO"/>
+        </w:rPr>
+      </w:pPr>
+      <w:r>
+        <w:rPr>
+          <w:noProof/>
+        </w:rPr>
+        <w:drawing>
+          <wp:inline distT="0" distB="0" distL="0" distR="0" wp14:anchorId="44A44A4C" wp14:editId="71D2BF9F">
+            <wp:extent cx="4933950" cy="1760506"/>
+            <wp:effectExtent l="0" t="0" r="0" b="0"/>
+            <wp:docPr id="1333298324" name="Imagen 5" descr="Aplicación de cintas adicionales en el empeine y el lateral de la horma para reforzar el enmascarado y cubrir uniformemente la superficie. "/>
+            <wp:cNvGraphicFramePr>
+              <a:graphicFrameLocks xmlns:a="http://schemas.openxmlformats.org/drawingml/2006/main" noChangeAspect="1"/>
+            </wp:cNvGraphicFramePr>
+            <a:graphic xmlns:a="http://schemas.openxmlformats.org/drawingml/2006/main">
+              <a:graphicData uri="http://schemas.openxmlformats.org/drawingml/2006/picture">
+                <pic:pic xmlns:pic="http://schemas.openxmlformats.org/drawingml/2006/picture">
+                  <pic:nvPicPr>
+                    <pic:cNvPr id="0" name="Picture 4" descr="Aplicación de cintas adicionales en el empeine y el lateral de la horma para reforzar el enmascarado y cubrir uniformemente la superficie. "/>
                     <pic:cNvPicPr>
                       <a:picLocks noChangeAspect="1" noChangeArrowheads="1"/>
                     </pic:cNvPicPr>
                   </pic:nvPicPr>
                   <pic:blipFill>
                     <a:blip r:embed="rId29">
+                      <a:extLst>
+                        <a:ext uri="{28A0092B-C50C-407E-A947-70E740481C1C}">
+                          <a14:useLocalDpi xmlns:a14="http://schemas.microsoft.com/office/drawing/2010/main" val="0"/>
+                        </a:ext>
+                      </a:extLst>
+                    </a:blip>
+                    <a:srcRect/>
+                    <a:stretch>
+                      <a:fillRect/>
+                    </a:stretch>
+                  </pic:blipFill>
+                  <pic:spPr bwMode="auto">
+                    <a:xfrm>
+                      <a:off x="0" y="0"/>
+                      <a:ext cx="4962667" cy="1770753"/>
+                    </a:xfrm>
+                    <a:prstGeom prst="rect">
+                      <a:avLst/>
+                    </a:prstGeom>
+                    <a:noFill/>
+                    <a:ln>
+                      <a:noFill/>
+                    </a:ln>
+                  </pic:spPr>
+                </pic:pic>
+              </a:graphicData>
+            </a:graphic>
+          </wp:inline>
+        </w:drawing>
+      </w:r>
+    </w:p>
+    <w:p>
+      <w:pPr>
+        <w:pStyle w:val="Ttulo4"/>
+      </w:pPr>
+      <w:r>
+        <w:t>Cobertura lateral completa de la horma</w:t>
+      </w:r>
+    </w:p>
+    <w:p>
+      <w:pPr>
+        <w:rPr>
+          <w:lang w:val="es-419" w:eastAsia="es-CO"/>
+        </w:rPr>
+      </w:pPr>
+      <w:r>
+        <w:rPr>
+          <w:lang w:val="es-419" w:eastAsia="es-CO"/>
+        </w:rPr>
+        <w:t xml:space="preserve">Para continuar con el proceso de enmascarado, se deben colocar tiras de cinta en los laterales y la parte posterior de la horma. Estas franjas deben ubicarse de manera paralela a la cinta de refuerzo previamente colocada, es decir, siguiendo la línea de profundidad, extendiéndose tanto hacia arriba como hacia abajo desde dicha cinta de refuerzo, </w:t>
+      </w:r>
+      <w:r>
+        <w:rPr>
+          <w:lang w:val="es-419" w:eastAsia="es-CO"/>
+        </w:rPr>
+        <w:t>e</w:t>
+      </w:r>
+      <w:r>
+        <w:rPr>
+          <w:lang w:eastAsia="es-CO"/>
+        </w:rPr>
+        <w:t>n la siguiente figura</w:t>
+      </w:r>
+      <w:r>
+        <w:rPr>
+          <w:lang w:eastAsia="es-CO"/>
+        </w:rPr>
+        <w:t>,</w:t>
+      </w:r>
+      <w:r>
+        <w:rPr>
+          <w:lang w:eastAsia="es-CO"/>
+        </w:rPr>
+        <w:t xml:space="preserve"> se presenta </w:t>
+      </w:r>
+      <w:r>
+        <w:rPr>
+          <w:lang w:val="es-419" w:eastAsia="es-CO"/>
+        </w:rPr>
+        <w:t>el proceso de e</w:t>
+      </w:r>
+      <w:r>
+        <w:rPr>
+          <w:lang w:val="es-419" w:eastAsia="es-CO"/>
+        </w:rPr>
+        <w:t>nmascarado completo de ambos laterales de la horma con tiras de cinta superpuestas que aseguran una cobertura uniforme para el patronaje.</w:t>
+      </w:r>
+    </w:p>
+    <w:p>
+      <w:pPr>
+        <w:rPr>
+          <w:lang w:val="es-419" w:eastAsia="es-CO"/>
+        </w:rPr>
+      </w:pPr>
+    </w:p>
+    <w:p>
+      <w:pPr>
+        <w:rPr>
+          <w:lang w:val="es-419" w:eastAsia="es-CO"/>
+        </w:rPr>
+      </w:pPr>
+    </w:p>
+    <w:p>
+      <w:pPr>
+        <w:rPr>
+          <w:lang w:val="es-419" w:eastAsia="es-CO"/>
+        </w:rPr>
+      </w:pPr>
+    </w:p>
+    <w:p>
+      <w:pPr>
+        <w:pStyle w:val="Figura"/>
+        <w:rPr>
+          <w:lang w:val="es-419"/>
+        </w:rPr>
+      </w:pPr>
+      <w:r>
+        <w:rPr>
+          <w:lang w:val="es-419"/>
+        </w:rPr>
+        <w:lastRenderedPageBreak/>
+        <w:t>Cobertura lateral completa de la horma</w:t>
+      </w:r>
+    </w:p>
+    <w:p>
+      <w:pPr>
+        <w:jc w:val="center"/>
+        <w:rPr>
+          <w:lang w:val="es-419" w:eastAsia="es-CO"/>
+        </w:rPr>
+      </w:pPr>
+      <w:r>
+        <w:rPr>
+          <w:noProof/>
+        </w:rPr>
+        <w:drawing>
+          <wp:inline distT="0" distB="0" distL="0" distR="0" wp14:anchorId="1B6C76D4" wp14:editId="79C7CB4A">
+            <wp:extent cx="4981575" cy="1960589"/>
+            <wp:effectExtent l="0" t="0" r="0" b="1905"/>
+            <wp:docPr id="105483051" name="Imagen 6" descr="Enmascarado completo de ambos laterales de la horma con tiras de cinta superpuestas que aseguran una cobertura uniforme para el patronaje."/>
+            <wp:cNvGraphicFramePr>
+              <a:graphicFrameLocks xmlns:a="http://schemas.openxmlformats.org/drawingml/2006/main" noChangeAspect="1"/>
+            </wp:cNvGraphicFramePr>
+            <a:graphic xmlns:a="http://schemas.openxmlformats.org/drawingml/2006/main">
+              <a:graphicData uri="http://schemas.openxmlformats.org/drawingml/2006/picture">
+                <pic:pic xmlns:pic="http://schemas.openxmlformats.org/drawingml/2006/picture">
+                  <pic:nvPicPr>
+                    <pic:cNvPr id="0" name="Picture 6" descr="Enmascarado completo de ambos laterales de la horma con tiras de cinta superpuestas que aseguran una cobertura uniforme para el patronaje."/>
+                    <pic:cNvPicPr>
+                      <a:picLocks noChangeAspect="1" noChangeArrowheads="1"/>
+                    </pic:cNvPicPr>
+                  </pic:nvPicPr>
+                  <pic:blipFill>
+                    <a:blip r:embed="rId30">
+                      <a:extLst>
+                        <a:ext uri="{28A0092B-C50C-407E-A947-70E740481C1C}">
+                          <a14:useLocalDpi xmlns:a14="http://schemas.microsoft.com/office/drawing/2010/main" val="0"/>
+                        </a:ext>
+                      </a:extLst>
+                    </a:blip>
+                    <a:srcRect/>
+                    <a:stretch>
+                      <a:fillRect/>
+                    </a:stretch>
+                  </pic:blipFill>
+                  <pic:spPr bwMode="auto">
+                    <a:xfrm>
+                      <a:off x="0" y="0"/>
+                      <a:ext cx="4996731" cy="1966554"/>
+                    </a:xfrm>
+                    <a:prstGeom prst="rect">
+                      <a:avLst/>
+                    </a:prstGeom>
+                    <a:noFill/>
+                    <a:ln>
+                      <a:noFill/>
+                    </a:ln>
+                  </pic:spPr>
+                </pic:pic>
+              </a:graphicData>
+            </a:graphic>
+          </wp:inline>
+        </w:drawing>
+      </w:r>
+    </w:p>
+    <w:p>
+      <w:pPr>
+        <w:pStyle w:val="Ttulo4"/>
+      </w:pPr>
+      <w:r>
+        <w:t>Aplicación de cinta sobre la horma en el eje del empeine</w:t>
+      </w:r>
+    </w:p>
+    <w:p>
+      <w:pPr>
+        <w:rPr>
+          <w:lang w:val="es-419" w:eastAsia="es-CO"/>
+        </w:rPr>
+      </w:pPr>
+      <w:r>
+        <w:rPr>
+          <w:lang w:val="es-419" w:eastAsia="es-CO"/>
+        </w:rPr>
+        <w:t xml:space="preserve">Posteriormente, se aplican tiras de cinta de forma perpendicular al eje del empeine, cubriendo desde la punta hasta la parte superior de este. Para garantizar un enmascarado uniforme, cada tira debe superponerse a la mitad de la anterior. </w:t>
+      </w:r>
+      <w:r>
+        <w:rPr>
+          <w:lang w:val="es-419" w:eastAsia="es-CO"/>
+        </w:rPr>
+        <w:t>E</w:t>
+      </w:r>
+      <w:r>
+        <w:rPr>
+          <w:lang w:eastAsia="es-CO"/>
+        </w:rPr>
+        <w:t>n la siguiente figura</w:t>
+      </w:r>
+      <w:r>
+        <w:rPr>
+          <w:lang w:eastAsia="es-CO"/>
+        </w:rPr>
+        <w:t>,</w:t>
+      </w:r>
+      <w:r>
+        <w:rPr>
+          <w:lang w:eastAsia="es-CO"/>
+        </w:rPr>
+        <w:t xml:space="preserve"> se presenta </w:t>
+      </w:r>
+      <w:r>
+        <w:rPr>
+          <w:lang w:val="es-419" w:eastAsia="es-CO"/>
+        </w:rPr>
+        <w:t>el proceso de a</w:t>
+      </w:r>
+      <w:r>
+        <w:rPr>
+          <w:lang w:val="es-419" w:eastAsia="es-CO"/>
+        </w:rPr>
+        <w:t>plicación de cintas superpuestas en el empeine de la horma, cubriendo de la punta hacia arriba.</w:t>
+      </w:r>
+    </w:p>
+    <w:p>
+      <w:pPr>
+        <w:pStyle w:val="Figura"/>
+        <w:rPr>
+          <w:lang w:val="es-419"/>
+        </w:rPr>
+      </w:pPr>
+      <w:r>
+        <w:rPr>
+          <w:lang w:val="es-419"/>
+        </w:rPr>
+        <w:t>Aplicación de cinta sobre la horma en el eje del empeine</w:t>
+      </w:r>
+    </w:p>
+    <w:p>
+      <w:pPr>
+        <w:jc w:val="center"/>
+        <w:rPr>
+          <w:lang w:val="es-419" w:eastAsia="es-CO"/>
+        </w:rPr>
+      </w:pPr>
+      <w:r>
+        <w:rPr>
+          <w:noProof/>
+        </w:rPr>
+        <w:drawing>
+          <wp:inline distT="0" distB="0" distL="0" distR="0" wp14:anchorId="2114D46D" wp14:editId="24293125">
+            <wp:extent cx="4657725" cy="1782405"/>
+            <wp:effectExtent l="0" t="0" r="0" b="8890"/>
+            <wp:docPr id="1008866436" name="Imagen 7" descr="Aplicación de cintas superpuestas en el empeine de la horma, cubriendo de la punta hacia arriba."/>
+            <wp:cNvGraphicFramePr>
+              <a:graphicFrameLocks xmlns:a="http://schemas.openxmlformats.org/drawingml/2006/main" noChangeAspect="1"/>
+            </wp:cNvGraphicFramePr>
+            <a:graphic xmlns:a="http://schemas.openxmlformats.org/drawingml/2006/main">
+              <a:graphicData uri="http://schemas.openxmlformats.org/drawingml/2006/picture">
+                <pic:pic xmlns:pic="http://schemas.openxmlformats.org/drawingml/2006/picture">
+                  <pic:nvPicPr>
+                    <pic:cNvPr id="0" name="Picture 8" descr="Aplicación de cintas superpuestas en el empeine de la horma, cubriendo de la punta hacia arriba."/>
+                    <pic:cNvPicPr>
+                      <a:picLocks noChangeAspect="1" noChangeArrowheads="1"/>
+                    </pic:cNvPicPr>
+                  </pic:nvPicPr>
+                  <pic:blipFill>
+                    <a:blip r:embed="rId31">
+                      <a:extLst>
+                        <a:ext uri="{28A0092B-C50C-407E-A947-70E740481C1C}">
+                          <a14:useLocalDpi xmlns:a14="http://schemas.microsoft.com/office/drawing/2010/main" val="0"/>
+                        </a:ext>
+                      </a:extLst>
+                    </a:blip>
+                    <a:srcRect/>
+                    <a:stretch>
+                      <a:fillRect/>
+                    </a:stretch>
+                  </pic:blipFill>
+                  <pic:spPr bwMode="auto">
+                    <a:xfrm>
+                      <a:off x="0" y="0"/>
+                      <a:ext cx="4665559" cy="1785403"/>
+                    </a:xfrm>
+                    <a:prstGeom prst="rect">
+                      <a:avLst/>
+                    </a:prstGeom>
+                    <a:noFill/>
+                    <a:ln>
+                      <a:noFill/>
+                    </a:ln>
+                  </pic:spPr>
+                </pic:pic>
+              </a:graphicData>
+            </a:graphic>
+          </wp:inline>
+        </w:drawing>
+      </w:r>
+    </w:p>
+    <w:p>
+      <w:pPr>
+        <w:pStyle w:val="Ttulo4"/>
+      </w:pPr>
+      <w:r>
+        <w:lastRenderedPageBreak/>
+        <w:t>Marcación de bordes en la horma</w:t>
+      </w:r>
+    </w:p>
+    <w:p>
+      <w:pPr>
+        <w:rPr>
+          <w:lang w:eastAsia="es-CO"/>
+        </w:rPr>
+      </w:pPr>
+      <w:r>
+        <w:rPr>
+          <w:lang w:eastAsia="es-CO"/>
+        </w:rPr>
+        <w:t>A continuación, se coloca una cinta de refuerzo a lo largo del borde de la mesa y en el borde de la línea de plantilla. Luego, se marcan los bordes con un lápiz y se recorta el exceso de cinta tanto en la mesa como en la línea de plantilla de la horma.</w:t>
+      </w:r>
+    </w:p>
+    <w:p>
+      <w:pPr>
+        <w:pStyle w:val="Figura"/>
+      </w:pPr>
+      <w:r>
+        <w:t>Marcación de bordes en la horma</w:t>
+      </w:r>
+    </w:p>
+    <w:p>
+      <w:pPr>
+        <w:jc w:val="center"/>
+        <w:rPr>
+          <w:lang w:eastAsia="es-CO"/>
+        </w:rPr>
+      </w:pPr>
+      <w:r>
+        <w:rPr>
+          <w:noProof/>
+        </w:rPr>
+        <w:drawing>
+          <wp:inline distT="0" distB="0" distL="0" distR="0" wp14:anchorId="52451C59" wp14:editId="69A77C20">
+            <wp:extent cx="5010150" cy="3895725"/>
+            <wp:effectExtent l="0" t="0" r="0" b="9525"/>
+            <wp:docPr id="1472481555" name="Imagen 8" descr="Conjunto de vistas de una horma en las que se aprecia la cinta aplicada y la marcación de los bordes con lápiz antes del recorte."/>
+            <wp:cNvGraphicFramePr>
+              <a:graphicFrameLocks xmlns:a="http://schemas.openxmlformats.org/drawingml/2006/main" noChangeAspect="1"/>
+            </wp:cNvGraphicFramePr>
+            <a:graphic xmlns:a="http://schemas.openxmlformats.org/drawingml/2006/main">
+              <a:graphicData uri="http://schemas.openxmlformats.org/drawingml/2006/picture">
+                <pic:pic xmlns:pic="http://schemas.openxmlformats.org/drawingml/2006/picture">
+                  <pic:nvPicPr>
+                    <pic:cNvPr id="0" name="Picture 10" descr="Conjunto de vistas de una horma en las que se aprecia la cinta aplicada y la marcación de los bordes con lápiz antes del recorte."/>
+                    <pic:cNvPicPr>
+                      <a:picLocks noChangeAspect="1" noChangeArrowheads="1"/>
+                    </pic:cNvPicPr>
+                  </pic:nvPicPr>
+                  <pic:blipFill>
+                    <a:blip r:embed="rId32">
+                      <a:extLst>
+                        <a:ext uri="{28A0092B-C50C-407E-A947-70E740481C1C}">
+                          <a14:useLocalDpi xmlns:a14="http://schemas.microsoft.com/office/drawing/2010/main" val="0"/>
+                        </a:ext>
+                      </a:extLst>
+                    </a:blip>
+                    <a:srcRect/>
+                    <a:stretch>
+                      <a:fillRect/>
+                    </a:stretch>
+                  </pic:blipFill>
+                  <pic:spPr bwMode="auto">
+                    <a:xfrm>
+                      <a:off x="0" y="0"/>
+                      <a:ext cx="5010150" cy="3895725"/>
+                    </a:xfrm>
+                    <a:prstGeom prst="rect">
+                      <a:avLst/>
+                    </a:prstGeom>
+                    <a:noFill/>
+                    <a:ln>
+                      <a:noFill/>
+                    </a:ln>
+                  </pic:spPr>
+                </pic:pic>
+              </a:graphicData>
+            </a:graphic>
+          </wp:inline>
+        </w:drawing>
+      </w:r>
+    </w:p>
+    <w:p>
+      <w:pPr>
+        <w:pStyle w:val="Ttulo4"/>
+      </w:pPr>
+      <w:r>
+        <w:t>Cinta de enmascarar para refuerzo</w:t>
+      </w:r>
+    </w:p>
+    <w:p>
+      <w:pPr>
+        <w:rPr>
+          <w:lang w:eastAsia="es-CO"/>
+        </w:rPr>
+      </w:pPr>
+      <w:r>
+        <w:rPr>
+          <w:lang w:eastAsia="es-CO"/>
+        </w:rPr>
+        <w:t xml:space="preserve">Para marcar los ejes sobre la horma, tomamos una tira de cinta y la colocamos sobre la tabla de corte. Con un esfero, trazamos una línea recta en el centro de la cinta. Es importante destacar que esta tira debe ser lo suficientemente larga para cubrir tanto el empeine como el talón, ya que servirá como referencia para marcar los ejes de simetría. </w:t>
+      </w:r>
+      <w:r>
+        <w:rPr>
+          <w:lang w:val="es-419" w:eastAsia="es-CO"/>
+        </w:rPr>
+        <w:t>E</w:t>
+      </w:r>
+      <w:r>
+        <w:rPr>
+          <w:lang w:eastAsia="es-CO"/>
+        </w:rPr>
+        <w:t>n la siguiente figura</w:t>
+      </w:r>
+      <w:r>
+        <w:rPr>
+          <w:lang w:eastAsia="es-CO"/>
+        </w:rPr>
+        <w:t>,</w:t>
+      </w:r>
+      <w:r>
+        <w:rPr>
+          <w:lang w:eastAsia="es-CO"/>
+        </w:rPr>
+        <w:t xml:space="preserve"> se presenta </w:t>
+      </w:r>
+      <w:r>
+        <w:rPr>
+          <w:lang w:val="es-419" w:eastAsia="es-CO"/>
+        </w:rPr>
+        <w:t>el proceso de la t</w:t>
+      </w:r>
+      <w:r>
+        <w:rPr>
+          <w:lang w:val="es-419" w:eastAsia="es-CO"/>
+        </w:rPr>
+        <w:t xml:space="preserve">ira de cinta de enmascarar </w:t>
+      </w:r>
+      <w:r>
+        <w:rPr>
+          <w:lang w:val="es-419" w:eastAsia="es-CO"/>
+        </w:rPr>
+        <w:lastRenderedPageBreak/>
+        <w:t>recortada y alineada sobre una superficie de corte, lista para ser aplicada sobre la horma.</w:t>
+      </w:r>
+    </w:p>
+    <w:p>
+      <w:pPr>
+        <w:pStyle w:val="Figura"/>
+      </w:pPr>
+      <w:r>
+        <w:t>Cinta de enmascarar para refuerzo</w:t>
+      </w:r>
+    </w:p>
+    <w:p>
+      <w:pPr>
+        <w:jc w:val="center"/>
+        <w:rPr>
+          <w:lang w:eastAsia="es-CO"/>
+        </w:rPr>
+      </w:pPr>
+      <w:r>
+        <w:rPr>
+          <w:noProof/>
+        </w:rPr>
+        <w:drawing>
+          <wp:inline distT="0" distB="0" distL="0" distR="0" wp14:anchorId="22E4986A" wp14:editId="65336B5F">
+            <wp:extent cx="5257800" cy="2061251"/>
+            <wp:effectExtent l="0" t="0" r="0" b="0"/>
+            <wp:docPr id="1341225038" name="Imagen 9" descr="Tira de cinta de enmascarar recortada y alineada sobre una superficie de corte, lista para ser aplicada sobre la horma. "/>
+            <wp:cNvGraphicFramePr>
+              <a:graphicFrameLocks xmlns:a="http://schemas.openxmlformats.org/drawingml/2006/main" noChangeAspect="1"/>
+            </wp:cNvGraphicFramePr>
+            <a:graphic xmlns:a="http://schemas.openxmlformats.org/drawingml/2006/main">
+              <a:graphicData uri="http://schemas.openxmlformats.org/drawingml/2006/picture">
+                <pic:pic xmlns:pic="http://schemas.openxmlformats.org/drawingml/2006/picture">
+                  <pic:nvPicPr>
+                    <pic:cNvPr id="0" name="Picture 12" descr="Tira de cinta de enmascarar recortada y alineada sobre una superficie de corte, lista para ser aplicada sobre la horma. "/>
+                    <pic:cNvPicPr>
+                      <a:picLocks noChangeAspect="1" noChangeArrowheads="1"/>
+                    </pic:cNvPicPr>
+                  </pic:nvPicPr>
+                  <pic:blipFill>
+                    <a:blip r:embed="rId33">
+                      <a:extLst>
+                        <a:ext uri="{28A0092B-C50C-407E-A947-70E740481C1C}">
+                          <a14:useLocalDpi xmlns:a14="http://schemas.microsoft.com/office/drawing/2010/main" val="0"/>
+                        </a:ext>
+                      </a:extLst>
+                    </a:blip>
+                    <a:srcRect/>
+                    <a:stretch>
+                      <a:fillRect/>
+                    </a:stretch>
+                  </pic:blipFill>
+                  <pic:spPr bwMode="auto">
+                    <a:xfrm>
+                      <a:off x="0" y="0"/>
+                      <a:ext cx="5268271" cy="2065356"/>
+                    </a:xfrm>
+                    <a:prstGeom prst="rect">
+                      <a:avLst/>
+                    </a:prstGeom>
+                    <a:noFill/>
+                    <a:ln>
+                      <a:noFill/>
+                    </a:ln>
+                  </pic:spPr>
+                </pic:pic>
+              </a:graphicData>
+            </a:graphic>
+          </wp:inline>
+        </w:drawing>
+      </w:r>
+    </w:p>
+    <w:p>
+      <w:pPr>
+        <w:pStyle w:val="Ttulo4"/>
+      </w:pPr>
+      <w:r>
+        <w:t>Horma completamente enmascarada</w:t>
+      </w:r>
+    </w:p>
+    <w:p>
+      <w:pPr>
+        <w:rPr>
+          <w:lang w:eastAsia="es-CO"/>
+        </w:rPr>
+      </w:pPr>
+      <w:r>
+        <w:rPr>
+          <w:lang w:eastAsia="es-CO"/>
+        </w:rPr>
+        <w:t xml:space="preserve">Una vez dibujada la línea sobre la cinta, tomamos la horma y alineamos el eje marcado con los puntos medios del empeine previamente determinados. Del mismo modo, repetimos el proceso en el talón, </w:t>
+      </w:r>
+      <w:r>
+        <w:rPr>
+          <w:lang w:eastAsia="es-CO"/>
+        </w:rPr>
+        <w:t>e</w:t>
+      </w:r>
+      <w:r>
+        <w:rPr>
+          <w:lang w:eastAsia="es-CO"/>
+        </w:rPr>
+        <w:t>n la siguiente figura</w:t>
+      </w:r>
+      <w:r>
+        <w:rPr>
+          <w:lang w:eastAsia="es-CO"/>
+        </w:rPr>
+        <w:t>,</w:t>
+      </w:r>
+      <w:r>
+        <w:rPr>
+          <w:lang w:eastAsia="es-CO"/>
+        </w:rPr>
+        <w:t xml:space="preserve"> se presenta </w:t>
+      </w:r>
+      <w:r>
+        <w:rPr>
+          <w:lang w:val="es-419" w:eastAsia="es-CO"/>
+        </w:rPr>
+        <w:t>el proceso de v</w:t>
+      </w:r>
+      <w:r>
+        <w:rPr>
+          <w:lang w:val="es-419" w:eastAsia="es-CO"/>
+        </w:rPr>
+        <w:t>ista superior de la horma con cobertura total de cinta de enmascarar, lista para el trazado del diseño del calzado.</w:t>
+      </w:r>
+    </w:p>
+    <w:p>
+      <w:pPr>
+        <w:pStyle w:val="Figura"/>
+      </w:pPr>
+      <w:r>
+        <w:t>Horma completamente enmascarada</w:t>
+      </w:r>
+    </w:p>
+    <w:p>
+      <w:pPr>
+        <w:ind w:firstLine="0"/>
+        <w:jc w:val="center"/>
+        <w:rPr>
+          <w:lang w:eastAsia="es-CO"/>
+        </w:rPr>
+      </w:pPr>
+      <w:r>
+        <w:rPr>
+          <w:noProof/>
+        </w:rPr>
+        <w:drawing>
+          <wp:inline distT="0" distB="0" distL="0" distR="0" wp14:anchorId="13E1EEA4" wp14:editId="389F6EEB">
+            <wp:extent cx="5494696" cy="1581022"/>
+            <wp:effectExtent l="0" t="0" r="0" b="635"/>
+            <wp:docPr id="27" name="Imagen 27" descr="Vista superior de la horma con cobertura total de cinta de enmascarar, lista para el trazado del diseño del calzado. "/>
+            <wp:cNvGraphicFramePr>
+              <a:graphicFrameLocks xmlns:a="http://schemas.openxmlformats.org/drawingml/2006/main" noChangeAspect="1"/>
+            </wp:cNvGraphicFramePr>
+            <a:graphic xmlns:a="http://schemas.openxmlformats.org/drawingml/2006/main">
+              <a:graphicData uri="http://schemas.openxmlformats.org/drawingml/2006/picture">
+                <pic:pic xmlns:pic="http://schemas.openxmlformats.org/drawingml/2006/picture">
+                  <pic:nvPicPr>
+                    <pic:cNvPr id="0" name="Picture 44" descr="Vista superior de la horma con cobertura total de cinta de enmascarar, lista para el trazado del diseño del calzado. "/>
+                    <pic:cNvPicPr>
+                      <a:picLocks noChangeAspect="1" noChangeArrowheads="1"/>
+                    </pic:cNvPicPr>
+                  </pic:nvPicPr>
+                  <pic:blipFill>
+                    <a:blip r:embed="rId34">
+                      <a:extLst>
+                        <a:ext uri="{28A0092B-C50C-407E-A947-70E740481C1C}">
+                          <a14:useLocalDpi xmlns:a14="http://schemas.microsoft.com/office/drawing/2010/main" val="0"/>
+                        </a:ext>
+                      </a:extLst>
+                    </a:blip>
+                    <a:srcRect/>
+                    <a:stretch>
+                      <a:fillRect/>
+                    </a:stretch>
+                  </pic:blipFill>
+                  <pic:spPr bwMode="auto">
+                    <a:xfrm>
+                      <a:off x="0" y="0"/>
+                      <a:ext cx="5597987" cy="1610743"/>
+                    </a:xfrm>
+                    <a:prstGeom prst="rect">
+                      <a:avLst/>
+                    </a:prstGeom>
+                    <a:noFill/>
+                    <a:ln>
+                      <a:noFill/>
+                    </a:ln>
+                  </pic:spPr>
+                </pic:pic>
+              </a:graphicData>
+            </a:graphic>
+          </wp:inline>
+        </w:drawing>
+      </w:r>
+    </w:p>
+    <w:p>
+      <w:pPr>
+        <w:pStyle w:val="Ttulo4"/>
+      </w:pPr>
+      <w:r>
+        <w:lastRenderedPageBreak/>
+        <w:t>Horma enmascarada con línea central marcada</w:t>
+      </w:r>
+    </w:p>
+    <w:p>
+      <w:pPr>
+        <w:rPr>
+          <w:lang w:eastAsia="es-CO"/>
+        </w:rPr>
+      </w:pPr>
+      <w:r>
+        <w:rPr>
+          <w:lang w:eastAsia="es-CO"/>
+        </w:rPr>
+        <w:t xml:space="preserve">Por </w:t>
+      </w:r>
+      <w:r>
+        <w:rPr>
+          <w:lang w:eastAsia="es-CO"/>
+        </w:rPr>
+        <w:t>último,</w:t>
+      </w:r>
+      <w:r>
+        <w:rPr>
+          <w:lang w:eastAsia="es-CO"/>
+        </w:rPr>
+        <w:t xml:space="preserve"> se refilan los sobrantes de cinta y se realiza un corte por los ejes obtenidos, es decir, el eje del empeine y del talón.</w:t>
+      </w:r>
+    </w:p>
+    <w:p>
+      <w:pPr>
+        <w:pStyle w:val="Figura"/>
+      </w:pPr>
+      <w:r>
+        <w:t>Horma enmascarada con línea central marcada</w:t>
+      </w:r>
+    </w:p>
+    <w:p>
+      <w:pPr>
+        <w:ind w:firstLine="0"/>
+        <w:jc w:val="center"/>
+        <w:rPr>
+          <w:lang w:eastAsia="es-CO"/>
+        </w:rPr>
+      </w:pPr>
+      <w:r>
+        <w:rPr>
+          <w:noProof/>
+        </w:rPr>
+        <w:drawing>
+          <wp:inline distT="0" distB="0" distL="0" distR="0" wp14:anchorId="65504D8D" wp14:editId="308705F3">
+            <wp:extent cx="6067425" cy="2314575"/>
+            <wp:effectExtent l="0" t="0" r="9525" b="9525"/>
+            <wp:docPr id="28" name="Imagen 28" descr="Horma completamente cubierta con cinta de enmascarar y línea central trazada sobre la superficie para guiar el diseño del patrón. "/>
+            <wp:cNvGraphicFramePr>
+              <a:graphicFrameLocks xmlns:a="http://schemas.openxmlformats.org/drawingml/2006/main" noChangeAspect="1"/>
+            </wp:cNvGraphicFramePr>
+            <a:graphic xmlns:a="http://schemas.openxmlformats.org/drawingml/2006/main">
+              <a:graphicData uri="http://schemas.openxmlformats.org/drawingml/2006/picture">
+                <pic:pic xmlns:pic="http://schemas.openxmlformats.org/drawingml/2006/picture">
+                  <pic:nvPicPr>
+                    <pic:cNvPr id="0" name="Picture 46" descr="Horma completamente cubierta con cinta de enmascarar y línea central trazada sobre la superficie para guiar el diseño del patrón. "/>
+                    <pic:cNvPicPr>
+                      <a:picLocks noChangeAspect="1" noChangeArrowheads="1"/>
+                    </pic:cNvPicPr>
+                  </pic:nvPicPr>
+                  <pic:blipFill>
+                    <a:blip r:embed="rId35">
                       <a:extLst>
                         <a:ext uri="{28A0092B-C50C-407E-A947-70E740481C1C}">
                           <a14:useLocalDpi xmlns:a14="http://schemas.microsoft.com/office/drawing/2010/main" val="0"/>
@@ -13020,881 +13889,12 @@
     </w:p>
     <w:p>
       <w:pPr>
-        <w:rPr>
-          <w:lang w:val="es-419" w:eastAsia="es-CO"/>
-        </w:rPr>
-      </w:pPr>
-      <w:r>
-        <w:rPr>
-          <w:b/>
-          <w:bCs/>
-          <w:lang w:val="es-419" w:eastAsia="es-CO"/>
-        </w:rPr>
-        <w:t>Nota</w:t>
-      </w:r>
-      <w:r>
-        <w:rPr>
-          <w:lang w:val="es-419" w:eastAsia="es-CO"/>
-        </w:rPr>
-        <w:t>. Es importante mantener siempre visibles los puntos centrales para evitar que se pierdan al colocar la cinta.</w:t>
-      </w:r>
-    </w:p>
-    <w:p>
-      <w:pPr>
-        <w:rPr>
-          <w:lang w:val="es-419" w:eastAsia="es-CO"/>
-        </w:rPr>
-      </w:pPr>
-    </w:p>
-    <w:p>
-      <w:pPr>
-        <w:pStyle w:val="Ttulo4"/>
-      </w:pPr>
-      <w:r>
-        <w:lastRenderedPageBreak/>
-        <w:t>Refuerzo del enmascarado en el empeine y lateral</w:t>
-      </w:r>
-    </w:p>
-    <w:p>
-      <w:pPr>
-        <w:rPr>
-          <w:lang w:val="es-419" w:eastAsia="es-CO"/>
-        </w:rPr>
-      </w:pPr>
-      <w:r>
-        <w:rPr>
-          <w:lang w:val="es-419" w:eastAsia="es-CO"/>
-        </w:rPr>
-        <w:t>A continuación, se coloca una cinta de refuerzo aproximadamente a la altura de la línea de profundidad en ambas caras de la horma. Luego, se aplica otra cinta sobre la línea de plantilla, rodeando el contorno de la horma. Esta debe quedar colocada de modo que una mitad cubra el perfil lateral y la otra se doble hacia la cara plantar.</w:t>
-      </w:r>
-    </w:p>
-    <w:p>
-      <w:pPr>
-        <w:pStyle w:val="Figura"/>
-        <w:rPr>
-          <w:lang w:val="es-419"/>
-        </w:rPr>
-      </w:pPr>
-      <w:r>
-        <w:rPr>
-          <w:lang w:val="es-419"/>
-        </w:rPr>
-        <w:t>Refuerzo del enmascarado en el empeine y lateral</w:t>
-      </w:r>
-    </w:p>
-    <w:p>
-      <w:pPr>
-        <w:ind w:firstLine="0"/>
-        <w:jc w:val="center"/>
-        <w:rPr>
-          <w:lang w:val="es-419" w:eastAsia="es-CO"/>
-        </w:rPr>
-      </w:pPr>
-      <w:r>
-        <w:rPr>
-          <w:noProof/>
-        </w:rPr>
-        <w:drawing>
-          <wp:inline distT="0" distB="0" distL="0" distR="0" wp14:anchorId="1A6D795B" wp14:editId="2C37AC95">
-            <wp:extent cx="5267325" cy="2012516"/>
-            <wp:effectExtent l="0" t="0" r="0" b="6985"/>
-            <wp:docPr id="22" name="Imagen 22" descr="Aplicación de cintas adicionales en el empeine y el lateral de la horma para reforzar el enmascarado y cubrir uniformemente la superficie. "/>
-            <wp:cNvGraphicFramePr>
-              <a:graphicFrameLocks xmlns:a="http://schemas.openxmlformats.org/drawingml/2006/main" noChangeAspect="1"/>
-            </wp:cNvGraphicFramePr>
-            <a:graphic xmlns:a="http://schemas.openxmlformats.org/drawingml/2006/main">
-              <a:graphicData uri="http://schemas.openxmlformats.org/drawingml/2006/picture">
-                <pic:pic xmlns:pic="http://schemas.openxmlformats.org/drawingml/2006/picture">
-                  <pic:nvPicPr>
-                    <pic:cNvPr id="0" name="Picture 34" descr="Aplicación de cintas adicionales en el empeine y el lateral de la horma para reforzar el enmascarado y cubrir uniformemente la superficie. "/>
-                    <pic:cNvPicPr>
-                      <a:picLocks noChangeAspect="1" noChangeArrowheads="1"/>
-                    </pic:cNvPicPr>
-                  </pic:nvPicPr>
-                  <pic:blipFill>
-                    <a:blip r:embed="rId30">
-                      <a:extLst>
-                        <a:ext uri="{28A0092B-C50C-407E-A947-70E740481C1C}">
-                          <a14:useLocalDpi xmlns:a14="http://schemas.microsoft.com/office/drawing/2010/main" val="0"/>
-                        </a:ext>
-                      </a:extLst>
-                    </a:blip>
-                    <a:srcRect/>
-                    <a:stretch>
-                      <a:fillRect/>
-                    </a:stretch>
-                  </pic:blipFill>
-                  <pic:spPr bwMode="auto">
-                    <a:xfrm>
-                      <a:off x="0" y="0"/>
-                      <a:ext cx="5280915" cy="2017709"/>
-                    </a:xfrm>
-                    <a:prstGeom prst="rect">
-                      <a:avLst/>
-                    </a:prstGeom>
-                    <a:noFill/>
-                    <a:ln>
-                      <a:noFill/>
-                    </a:ln>
-                  </pic:spPr>
-                </pic:pic>
-              </a:graphicData>
-            </a:graphic>
-          </wp:inline>
-        </w:drawing>
-      </w:r>
-    </w:p>
-    <w:p>
-      <w:pPr>
-        <w:pStyle w:val="Ttulo4"/>
-      </w:pPr>
-    </w:p>
-    <w:p>
-      <w:pPr>
-        <w:pStyle w:val="Ttulo4"/>
-      </w:pPr>
-      <w:r>
-        <w:t>Cobertura lateral completa de la horma</w:t>
-      </w:r>
-    </w:p>
-    <w:p>
-      <w:pPr>
-        <w:rPr>
-          <w:lang w:val="es-419" w:eastAsia="es-CO"/>
-        </w:rPr>
-      </w:pPr>
-      <w:r>
-        <w:rPr>
-          <w:lang w:val="es-419" w:eastAsia="es-CO"/>
-        </w:rPr>
-        <w:t xml:space="preserve">Para continuar con el proceso de enmascarado, se deben colocar tiras de cinta en los laterales y la parte posterior de la horma. Estas franjas deben ubicarse de manera paralela a la cinta de refuerzo previamente colocada, es decir, siguiendo la línea de profundidad, extendiéndose tanto hacia arriba como hacia abajo desde dicha cinta de refuerzo, </w:t>
-      </w:r>
-      <w:r>
-        <w:rPr>
-          <w:lang w:val="es-419" w:eastAsia="es-CO"/>
-        </w:rPr>
-        <w:t>e</w:t>
-      </w:r>
-      <w:r>
-        <w:rPr>
-          <w:lang w:eastAsia="es-CO"/>
-        </w:rPr>
-        <w:t>n la siguiente figura</w:t>
-      </w:r>
-      <w:r>
-        <w:rPr>
-          <w:lang w:eastAsia="es-CO"/>
-        </w:rPr>
-        <w:t>,</w:t>
-      </w:r>
-      <w:r>
-        <w:rPr>
-          <w:lang w:eastAsia="es-CO"/>
-        </w:rPr>
-        <w:t xml:space="preserve"> se presenta </w:t>
-      </w:r>
-      <w:r>
-        <w:rPr>
-          <w:lang w:val="es-419" w:eastAsia="es-CO"/>
-        </w:rPr>
-        <w:t>el proceso de e</w:t>
-      </w:r>
-      <w:r>
-        <w:rPr>
-          <w:lang w:val="es-419" w:eastAsia="es-CO"/>
-        </w:rPr>
-        <w:t>nmascarado completo de ambos laterales de la horma con tiras de cinta superpuestas que aseguran una cobertura uniforme para el patronaje.</w:t>
-      </w:r>
-    </w:p>
-    <w:p>
-      <w:pPr>
-        <w:rPr>
-          <w:lang w:val="es-419" w:eastAsia="es-CO"/>
-        </w:rPr>
-      </w:pPr>
-    </w:p>
-    <w:p>
-      <w:pPr>
-        <w:rPr>
-          <w:lang w:val="es-419" w:eastAsia="es-CO"/>
-        </w:rPr>
-      </w:pPr>
-    </w:p>
-    <w:p>
-      <w:pPr>
-        <w:pStyle w:val="Figura"/>
-        <w:rPr>
-          <w:lang w:val="es-419"/>
-        </w:rPr>
-      </w:pPr>
-      <w:r>
-        <w:rPr>
-          <w:lang w:val="es-419"/>
-        </w:rPr>
-        <w:lastRenderedPageBreak/>
-        <w:t>Cobertura lateral completa de la horma</w:t>
-      </w:r>
-    </w:p>
-    <w:p>
-      <w:pPr>
-        <w:ind w:firstLine="0"/>
-        <w:jc w:val="center"/>
-        <w:rPr>
-          <w:lang w:val="es-419" w:eastAsia="es-CO"/>
-        </w:rPr>
-      </w:pPr>
-      <w:r>
-        <w:rPr>
-          <w:noProof/>
-        </w:rPr>
-        <w:drawing>
-          <wp:inline distT="0" distB="0" distL="0" distR="0" wp14:anchorId="09506DE0" wp14:editId="5F03BE39">
-            <wp:extent cx="5086350" cy="1881253"/>
-            <wp:effectExtent l="0" t="0" r="0" b="5080"/>
-            <wp:docPr id="23" name="Imagen 23" descr="Enmascarado completo de ambos laterales de la horma con tiras de cinta superpuestas que aseguran una cobertura uniforme para el patronaje."/>
-            <wp:cNvGraphicFramePr>
-              <a:graphicFrameLocks xmlns:a="http://schemas.openxmlformats.org/drawingml/2006/main" noChangeAspect="1"/>
-            </wp:cNvGraphicFramePr>
-            <a:graphic xmlns:a="http://schemas.openxmlformats.org/drawingml/2006/main">
-              <a:graphicData uri="http://schemas.openxmlformats.org/drawingml/2006/picture">
-                <pic:pic xmlns:pic="http://schemas.openxmlformats.org/drawingml/2006/picture">
-                  <pic:nvPicPr>
-                    <pic:cNvPr id="0" name="Picture 36" descr="Enmascarado completo de ambos laterales de la horma con tiras de cinta superpuestas que aseguran una cobertura uniforme para el patronaje."/>
-                    <pic:cNvPicPr>
-                      <a:picLocks noChangeAspect="1" noChangeArrowheads="1"/>
-                    </pic:cNvPicPr>
-                  </pic:nvPicPr>
-                  <pic:blipFill>
-                    <a:blip r:embed="rId31">
-                      <a:extLst>
-                        <a:ext uri="{28A0092B-C50C-407E-A947-70E740481C1C}">
-                          <a14:useLocalDpi xmlns:a14="http://schemas.microsoft.com/office/drawing/2010/main" val="0"/>
-                        </a:ext>
-                      </a:extLst>
-                    </a:blip>
-                    <a:srcRect/>
-                    <a:stretch>
-                      <a:fillRect/>
-                    </a:stretch>
-                  </pic:blipFill>
-                  <pic:spPr bwMode="auto">
-                    <a:xfrm>
-                      <a:off x="0" y="0"/>
-                      <a:ext cx="5140600" cy="1901318"/>
-                    </a:xfrm>
-                    <a:prstGeom prst="rect">
-                      <a:avLst/>
-                    </a:prstGeom>
-                    <a:noFill/>
-                    <a:ln>
-                      <a:noFill/>
-                    </a:ln>
-                  </pic:spPr>
-                </pic:pic>
-              </a:graphicData>
-            </a:graphic>
-          </wp:inline>
-        </w:drawing>
-      </w:r>
-    </w:p>
-    <w:p>
-      <w:pPr>
-        <w:pStyle w:val="Ttulo4"/>
-      </w:pPr>
-      <w:r>
-        <w:t>Aplicación de cinta sobre la horma en el eje del empeine</w:t>
-      </w:r>
-    </w:p>
-    <w:p>
-      <w:pPr>
-        <w:rPr>
-          <w:lang w:val="es-419" w:eastAsia="es-CO"/>
-        </w:rPr>
-      </w:pPr>
-      <w:r>
-        <w:rPr>
-          <w:lang w:val="es-419" w:eastAsia="es-CO"/>
-        </w:rPr>
-        <w:t xml:space="preserve">Posteriormente, se aplican tiras de cinta de forma perpendicular al eje del empeine, cubriendo desde la punta hasta la parte superior de este. Para garantizar un enmascarado uniforme, cada tira debe superponerse a la mitad de la anterior. </w:t>
-      </w:r>
-      <w:r>
-        <w:rPr>
-          <w:lang w:val="es-419" w:eastAsia="es-CO"/>
-        </w:rPr>
-        <w:t>E</w:t>
-      </w:r>
-      <w:r>
-        <w:rPr>
-          <w:lang w:eastAsia="es-CO"/>
-        </w:rPr>
-        <w:t>n la siguiente figura</w:t>
-      </w:r>
-      <w:r>
-        <w:rPr>
-          <w:lang w:eastAsia="es-CO"/>
-        </w:rPr>
-        <w:t>,</w:t>
-      </w:r>
-      <w:r>
-        <w:rPr>
-          <w:lang w:eastAsia="es-CO"/>
-        </w:rPr>
-        <w:t xml:space="preserve"> se presenta </w:t>
-      </w:r>
-      <w:r>
-        <w:rPr>
-          <w:lang w:val="es-419" w:eastAsia="es-CO"/>
-        </w:rPr>
-        <w:t>el proceso de a</w:t>
-      </w:r>
-      <w:r>
-        <w:rPr>
-          <w:lang w:val="es-419" w:eastAsia="es-CO"/>
-        </w:rPr>
-        <w:t>plicación de cintas superpuestas en el empeine de la horma, cubriendo de la punta hacia arriba.</w:t>
-      </w:r>
-    </w:p>
-    <w:p>
-      <w:pPr>
-        <w:pStyle w:val="Figura"/>
-        <w:rPr>
-          <w:lang w:val="es-419"/>
-        </w:rPr>
-      </w:pPr>
-      <w:r>
-        <w:rPr>
-          <w:lang w:val="es-419"/>
-        </w:rPr>
-        <w:t>Aplicación de cinta sobre la horma en el eje del empeine</w:t>
-      </w:r>
-    </w:p>
-    <w:p>
-      <w:pPr>
-        <w:ind w:firstLine="0"/>
-        <w:jc w:val="center"/>
-        <w:rPr>
-          <w:lang w:val="es-419" w:eastAsia="es-CO"/>
-        </w:rPr>
-      </w:pPr>
-      <w:r>
-        <w:rPr>
-          <w:noProof/>
-        </w:rPr>
-        <w:drawing>
-          <wp:inline distT="0" distB="0" distL="0" distR="0" wp14:anchorId="47FFD84C" wp14:editId="42EE1A29">
-            <wp:extent cx="4505325" cy="1718672"/>
-            <wp:effectExtent l="0" t="0" r="0" b="0"/>
-            <wp:docPr id="24" name="Imagen 24" descr="Aplicación de cintas superpuestas en el empeine de la horma, cubriendo de la punta hacia arriba."/>
-            <wp:cNvGraphicFramePr>
-              <a:graphicFrameLocks xmlns:a="http://schemas.openxmlformats.org/drawingml/2006/main" noChangeAspect="1"/>
-            </wp:cNvGraphicFramePr>
-            <a:graphic xmlns:a="http://schemas.openxmlformats.org/drawingml/2006/main">
-              <a:graphicData uri="http://schemas.openxmlformats.org/drawingml/2006/picture">
-                <pic:pic xmlns:pic="http://schemas.openxmlformats.org/drawingml/2006/picture">
-                  <pic:nvPicPr>
-                    <pic:cNvPr id="0" name="Picture 38" descr="Aplicación de cintas superpuestas en el empeine de la horma, cubriendo de la punta hacia arriba."/>
-                    <pic:cNvPicPr>
-                      <a:picLocks noChangeAspect="1" noChangeArrowheads="1"/>
-                    </pic:cNvPicPr>
-                  </pic:nvPicPr>
-                  <pic:blipFill>
-                    <a:blip r:embed="rId32">
-                      <a:extLst>
-                        <a:ext uri="{28A0092B-C50C-407E-A947-70E740481C1C}">
-                          <a14:useLocalDpi xmlns:a14="http://schemas.microsoft.com/office/drawing/2010/main" val="0"/>
-                        </a:ext>
-                      </a:extLst>
-                    </a:blip>
-                    <a:srcRect/>
-                    <a:stretch>
-                      <a:fillRect/>
-                    </a:stretch>
-                  </pic:blipFill>
-                  <pic:spPr bwMode="auto">
-                    <a:xfrm>
-                      <a:off x="0" y="0"/>
-                      <a:ext cx="4517098" cy="1723163"/>
-                    </a:xfrm>
-                    <a:prstGeom prst="rect">
-                      <a:avLst/>
-                    </a:prstGeom>
-                    <a:noFill/>
-                    <a:ln>
-                      <a:noFill/>
-                    </a:ln>
-                  </pic:spPr>
-                </pic:pic>
-              </a:graphicData>
-            </a:graphic>
-          </wp:inline>
-        </w:drawing>
-      </w:r>
-    </w:p>
-    <w:p>
-      <w:pPr>
-        <w:pStyle w:val="Ttulo4"/>
-      </w:pPr>
-      <w:r>
-        <w:t>Marcación de bordes en la horma</w:t>
-      </w:r>
-    </w:p>
-    <w:p>
-      <w:pPr>
-        <w:rPr>
-          <w:lang w:eastAsia="es-CO"/>
-        </w:rPr>
-      </w:pPr>
-      <w:r>
-        <w:rPr>
-          <w:lang w:eastAsia="es-CO"/>
-        </w:rPr>
-        <w:t>A continuación, se coloca una cinta de refuerzo a lo largo del borde de la mesa y en el borde de la línea de plantilla. Luego, se marcan los bordes con un lápiz y se recorta el exceso de cinta tanto en la mesa como en la línea de plantilla de la horma.</w:t>
-      </w:r>
-    </w:p>
-    <w:p>
-      <w:pPr>
-        <w:pStyle w:val="Figura"/>
-      </w:pPr>
-      <w:r>
-        <w:lastRenderedPageBreak/>
-        <w:t>Marcación de bordes en la horma</w:t>
-      </w:r>
-    </w:p>
-    <w:p>
-      <w:pPr>
-        <w:ind w:firstLine="0"/>
-        <w:jc w:val="center"/>
-        <w:rPr>
-          <w:lang w:eastAsia="es-CO"/>
-        </w:rPr>
-      </w:pPr>
-      <w:r>
-        <w:rPr>
-          <w:noProof/>
-        </w:rPr>
-        <w:drawing>
-          <wp:inline distT="0" distB="0" distL="0" distR="0" wp14:anchorId="72567D40" wp14:editId="284A522A">
-            <wp:extent cx="4581525" cy="1747741"/>
-            <wp:effectExtent l="0" t="0" r="0" b="5080"/>
-            <wp:docPr id="25" name="Imagen 25" descr="Conjunto de vistas de una horma en las que se aprecia la cinta aplicada y la marcación de los bordes con lápiz antes del recorte."/>
-            <wp:cNvGraphicFramePr>
-              <a:graphicFrameLocks xmlns:a="http://schemas.openxmlformats.org/drawingml/2006/main" noChangeAspect="1"/>
-            </wp:cNvGraphicFramePr>
-            <a:graphic xmlns:a="http://schemas.openxmlformats.org/drawingml/2006/main">
-              <a:graphicData uri="http://schemas.openxmlformats.org/drawingml/2006/picture">
-                <pic:pic xmlns:pic="http://schemas.openxmlformats.org/drawingml/2006/picture">
-                  <pic:nvPicPr>
-                    <pic:cNvPr id="0" name="Picture 40" descr="Conjunto de vistas de una horma en las que se aprecia la cinta aplicada y la marcación de los bordes con lápiz antes del recorte."/>
-                    <pic:cNvPicPr>
-                      <a:picLocks noChangeAspect="1" noChangeArrowheads="1"/>
-                    </pic:cNvPicPr>
-                  </pic:nvPicPr>
-                  <pic:blipFill>
-                    <a:blip r:embed="rId33">
-                      <a:extLst>
-                        <a:ext uri="{28A0092B-C50C-407E-A947-70E740481C1C}">
-                          <a14:useLocalDpi xmlns:a14="http://schemas.microsoft.com/office/drawing/2010/main" val="0"/>
-                        </a:ext>
-                      </a:extLst>
-                    </a:blip>
-                    <a:srcRect/>
-                    <a:stretch>
-                      <a:fillRect/>
-                    </a:stretch>
-                  </pic:blipFill>
-                  <pic:spPr bwMode="auto">
-                    <a:xfrm>
-                      <a:off x="0" y="0"/>
-                      <a:ext cx="4591818" cy="1751667"/>
-                    </a:xfrm>
-                    <a:prstGeom prst="rect">
-                      <a:avLst/>
-                    </a:prstGeom>
-                    <a:noFill/>
-                    <a:ln>
-                      <a:noFill/>
-                    </a:ln>
-                  </pic:spPr>
-                </pic:pic>
-              </a:graphicData>
-            </a:graphic>
-          </wp:inline>
-        </w:drawing>
-      </w:r>
-    </w:p>
-    <w:p>
-      <w:pPr>
-        <w:pStyle w:val="Ttulo4"/>
-      </w:pPr>
-      <w:r>
-        <w:t>Cinta de enmascarar para refuerzo</w:t>
-      </w:r>
-    </w:p>
-    <w:p>
-      <w:pPr>
-        <w:rPr>
-          <w:lang w:eastAsia="es-CO"/>
-        </w:rPr>
-      </w:pPr>
-      <w:r>
-        <w:rPr>
-          <w:lang w:eastAsia="es-CO"/>
-        </w:rPr>
-        <w:t xml:space="preserve">Para marcar los ejes sobre la horma, tomamos una tira de cinta y la colocamos sobre la tabla de corte. Con un esfero, trazamos una línea recta en el centro de la cinta. Es importante destacar que esta tira debe ser lo suficientemente larga para cubrir tanto el empeine como el talón, ya que servirá como referencia para marcar los ejes de simetría. </w:t>
-      </w:r>
-      <w:r>
-        <w:rPr>
-          <w:lang w:val="es-419" w:eastAsia="es-CO"/>
-        </w:rPr>
-        <w:t>E</w:t>
-      </w:r>
-      <w:r>
-        <w:rPr>
-          <w:lang w:eastAsia="es-CO"/>
-        </w:rPr>
-        <w:t>n la siguiente figura</w:t>
-      </w:r>
-      <w:r>
-        <w:rPr>
-          <w:lang w:eastAsia="es-CO"/>
-        </w:rPr>
-        <w:t>,</w:t>
-      </w:r>
-      <w:r>
-        <w:rPr>
-          <w:lang w:eastAsia="es-CO"/>
-        </w:rPr>
-        <w:t xml:space="preserve"> se presenta </w:t>
-      </w:r>
-      <w:r>
-        <w:rPr>
-          <w:lang w:val="es-419" w:eastAsia="es-CO"/>
-        </w:rPr>
-        <w:t>el proceso de la t</w:t>
-      </w:r>
-      <w:r>
-        <w:rPr>
-          <w:lang w:val="es-419" w:eastAsia="es-CO"/>
-        </w:rPr>
-        <w:t>ira de cinta de enmascarar recortada y alineada sobre una superficie de corte, lista para ser aplicada sobre la horma.</w:t>
-      </w:r>
-    </w:p>
-    <w:p>
-      <w:pPr>
-        <w:pStyle w:val="Figura"/>
-      </w:pPr>
-      <w:r>
-        <w:t>Cinta de enmascarar para refuerzo</w:t>
-      </w:r>
-    </w:p>
-    <w:p>
-      <w:pPr>
-        <w:ind w:firstLine="0"/>
-        <w:jc w:val="center"/>
-        <w:rPr>
-          <w:lang w:eastAsia="es-CO"/>
-        </w:rPr>
-      </w:pPr>
-      <w:r>
-        <w:rPr>
-          <w:noProof/>
-        </w:rPr>
-        <w:drawing>
-          <wp:inline distT="0" distB="0" distL="0" distR="0" wp14:anchorId="2626E43F" wp14:editId="4AC2F9F2">
-            <wp:extent cx="3845199" cy="1466850"/>
-            <wp:effectExtent l="0" t="0" r="3175" b="0"/>
-            <wp:docPr id="26" name="Imagen 26" descr="Tira de cinta de enmascarar recortada y alineada sobre una superficie de corte, lista para ser aplicada sobre la horma. "/>
-            <wp:cNvGraphicFramePr>
-              <a:graphicFrameLocks xmlns:a="http://schemas.openxmlformats.org/drawingml/2006/main" noChangeAspect="1"/>
-            </wp:cNvGraphicFramePr>
-            <a:graphic xmlns:a="http://schemas.openxmlformats.org/drawingml/2006/main">
-              <a:graphicData uri="http://schemas.openxmlformats.org/drawingml/2006/picture">
-                <pic:pic xmlns:pic="http://schemas.openxmlformats.org/drawingml/2006/picture">
-                  <pic:nvPicPr>
-                    <pic:cNvPr id="0" name="Picture 42" descr="Tira de cinta de enmascarar recortada y alineada sobre una superficie de corte, lista para ser aplicada sobre la horma. "/>
-                    <pic:cNvPicPr>
-                      <a:picLocks noChangeAspect="1" noChangeArrowheads="1"/>
-                    </pic:cNvPicPr>
-                  </pic:nvPicPr>
-                  <pic:blipFill>
-                    <a:blip r:embed="rId34">
-                      <a:extLst>
-                        <a:ext uri="{28A0092B-C50C-407E-A947-70E740481C1C}">
-                          <a14:useLocalDpi xmlns:a14="http://schemas.microsoft.com/office/drawing/2010/main" val="0"/>
-                        </a:ext>
-                      </a:extLst>
-                    </a:blip>
-                    <a:srcRect/>
-                    <a:stretch>
-                      <a:fillRect/>
-                    </a:stretch>
-                  </pic:blipFill>
-                  <pic:spPr bwMode="auto">
-                    <a:xfrm>
-                      <a:off x="0" y="0"/>
-                      <a:ext cx="3866103" cy="1474825"/>
-                    </a:xfrm>
-                    <a:prstGeom prst="rect">
-                      <a:avLst/>
-                    </a:prstGeom>
-                    <a:noFill/>
-                    <a:ln>
-                      <a:noFill/>
-                    </a:ln>
-                  </pic:spPr>
-                </pic:pic>
-              </a:graphicData>
-            </a:graphic>
-          </wp:inline>
-        </w:drawing>
-      </w:r>
-    </w:p>
-    <w:p>
-      <w:pPr>
-        <w:rPr>
-          <w:lang w:eastAsia="es-CO"/>
-        </w:rPr>
-      </w:pPr>
-    </w:p>
-    <w:p>
-      <w:pPr>
-        <w:pStyle w:val="Ttulo4"/>
-      </w:pPr>
-      <w:r>
-        <w:lastRenderedPageBreak/>
-        <w:t>Horma completamente enmascarada</w:t>
-      </w:r>
-    </w:p>
-    <w:p>
-      <w:pPr>
-        <w:rPr>
-          <w:lang w:eastAsia="es-CO"/>
-        </w:rPr>
-      </w:pPr>
-      <w:r>
-        <w:rPr>
-          <w:lang w:eastAsia="es-CO"/>
-        </w:rPr>
-        <w:t xml:space="preserve">Una vez dibujada la línea sobre la cinta, tomamos la horma y alineamos el eje marcado con los puntos medios del empeine previamente determinados. Del mismo modo, repetimos el proceso en el talón, </w:t>
-      </w:r>
-      <w:r>
-        <w:rPr>
-          <w:lang w:eastAsia="es-CO"/>
-        </w:rPr>
-        <w:t>e</w:t>
-      </w:r>
-      <w:r>
-        <w:rPr>
-          <w:lang w:eastAsia="es-CO"/>
-        </w:rPr>
-        <w:t>n la siguiente figura</w:t>
-      </w:r>
-      <w:r>
-        <w:rPr>
-          <w:lang w:eastAsia="es-CO"/>
-        </w:rPr>
-        <w:t>,</w:t>
-      </w:r>
-      <w:r>
-        <w:rPr>
-          <w:lang w:eastAsia="es-CO"/>
-        </w:rPr>
-        <w:t xml:space="preserve"> se presenta </w:t>
-      </w:r>
-      <w:r>
-        <w:rPr>
-          <w:lang w:val="es-419" w:eastAsia="es-CO"/>
-        </w:rPr>
-        <w:t>el proceso de v</w:t>
-      </w:r>
-      <w:r>
-        <w:rPr>
-          <w:lang w:val="es-419" w:eastAsia="es-CO"/>
-        </w:rPr>
-        <w:t>ista superior de la horma con cobertura total de cinta de enmascarar, lista para el trazado del diseño del calzado.</w:t>
-      </w:r>
-    </w:p>
-    <w:p>
-      <w:pPr>
-        <w:pStyle w:val="Figura"/>
-      </w:pPr>
-      <w:r>
-        <w:t>Horma completamente enmascarada</w:t>
-      </w:r>
-    </w:p>
-    <w:p>
-      <w:pPr>
-        <w:ind w:firstLine="0"/>
-        <w:jc w:val="center"/>
-        <w:rPr>
-          <w:lang w:eastAsia="es-CO"/>
-        </w:rPr>
-      </w:pPr>
-      <w:r>
-        <w:rPr>
-          <w:noProof/>
-        </w:rPr>
-        <w:drawing>
-          <wp:inline distT="0" distB="0" distL="0" distR="0" wp14:anchorId="13E1EEA4" wp14:editId="389F6EEB">
-            <wp:extent cx="5494696" cy="1581022"/>
-            <wp:effectExtent l="0" t="0" r="0" b="635"/>
-            <wp:docPr id="27" name="Imagen 27" descr="Vista superior de la horma con cobertura total de cinta de enmascarar, lista para el trazado del diseño del calzado. "/>
-            <wp:cNvGraphicFramePr>
-              <a:graphicFrameLocks xmlns:a="http://schemas.openxmlformats.org/drawingml/2006/main" noChangeAspect="1"/>
-            </wp:cNvGraphicFramePr>
-            <a:graphic xmlns:a="http://schemas.openxmlformats.org/drawingml/2006/main">
-              <a:graphicData uri="http://schemas.openxmlformats.org/drawingml/2006/picture">
-                <pic:pic xmlns:pic="http://schemas.openxmlformats.org/drawingml/2006/picture">
-                  <pic:nvPicPr>
-                    <pic:cNvPr id="0" name="Picture 44" descr="Vista superior de la horma con cobertura total de cinta de enmascarar, lista para el trazado del diseño del calzado. "/>
-                    <pic:cNvPicPr>
-                      <a:picLocks noChangeAspect="1" noChangeArrowheads="1"/>
-                    </pic:cNvPicPr>
-                  </pic:nvPicPr>
-                  <pic:blipFill>
-                    <a:blip r:embed="rId35">
-                      <a:extLst>
-                        <a:ext uri="{28A0092B-C50C-407E-A947-70E740481C1C}">
-                          <a14:useLocalDpi xmlns:a14="http://schemas.microsoft.com/office/drawing/2010/main" val="0"/>
-                        </a:ext>
-                      </a:extLst>
-                    </a:blip>
-                    <a:srcRect/>
-                    <a:stretch>
-                      <a:fillRect/>
-                    </a:stretch>
-                  </pic:blipFill>
-                  <pic:spPr bwMode="auto">
-                    <a:xfrm>
-                      <a:off x="0" y="0"/>
-                      <a:ext cx="5597987" cy="1610743"/>
-                    </a:xfrm>
-                    <a:prstGeom prst="rect">
-                      <a:avLst/>
-                    </a:prstGeom>
-                    <a:noFill/>
-                    <a:ln>
-                      <a:noFill/>
-                    </a:ln>
-                  </pic:spPr>
-                </pic:pic>
-              </a:graphicData>
-            </a:graphic>
-          </wp:inline>
-        </w:drawing>
-      </w:r>
-    </w:p>
-    <w:p>
-      <w:pPr>
-        <w:pStyle w:val="Ttulo4"/>
-      </w:pPr>
-      <w:r>
-        <w:t>Horma enmascarada con línea central marcada</w:t>
-      </w:r>
-    </w:p>
-    <w:p>
-      <w:pPr>
-        <w:rPr>
-          <w:lang w:eastAsia="es-CO"/>
-        </w:rPr>
-      </w:pPr>
-      <w:r>
-        <w:rPr>
-          <w:lang w:eastAsia="es-CO"/>
-        </w:rPr>
-        <w:t xml:space="preserve">Por </w:t>
-      </w:r>
-      <w:r>
-        <w:rPr>
-          <w:lang w:eastAsia="es-CO"/>
-        </w:rPr>
-        <w:t>último,</w:t>
-      </w:r>
-      <w:r>
-        <w:rPr>
-          <w:lang w:eastAsia="es-CO"/>
-        </w:rPr>
-        <w:t xml:space="preserve"> se refilan los sobrantes de cinta y se realiza un corte por los ejes obtenidos, es decir, el eje del empeine y del talón.</w:t>
-      </w:r>
-    </w:p>
-    <w:p>
-      <w:pPr>
-        <w:pStyle w:val="Figura"/>
-      </w:pPr>
-      <w:r>
-        <w:t>Horma enmascarada con línea central marcada</w:t>
-      </w:r>
-    </w:p>
-    <w:p>
-      <w:pPr>
-        <w:ind w:firstLine="0"/>
-        <w:jc w:val="center"/>
-        <w:rPr>
-          <w:lang w:eastAsia="es-CO"/>
-        </w:rPr>
-      </w:pPr>
-      <w:r>
-        <w:rPr>
-          <w:noProof/>
-        </w:rPr>
-        <w:drawing>
-          <wp:inline distT="0" distB="0" distL="0" distR="0" wp14:anchorId="65504D8D" wp14:editId="308705F3">
-            <wp:extent cx="6067425" cy="2314575"/>
-            <wp:effectExtent l="0" t="0" r="9525" b="9525"/>
-            <wp:docPr id="28" name="Imagen 28" descr="Horma completamente cubierta con cinta de enmascarar y línea central trazada sobre la superficie para guiar el diseño del patrón. "/>
-            <wp:cNvGraphicFramePr>
-              <a:graphicFrameLocks xmlns:a="http://schemas.openxmlformats.org/drawingml/2006/main" noChangeAspect="1"/>
-            </wp:cNvGraphicFramePr>
-            <a:graphic xmlns:a="http://schemas.openxmlformats.org/drawingml/2006/main">
-              <a:graphicData uri="http://schemas.openxmlformats.org/drawingml/2006/picture">
-                <pic:pic xmlns:pic="http://schemas.openxmlformats.org/drawingml/2006/picture">
-                  <pic:nvPicPr>
-                    <pic:cNvPr id="0" name="Picture 46" descr="Horma completamente cubierta con cinta de enmascarar y línea central trazada sobre la superficie para guiar el diseño del patrón. "/>
-                    <pic:cNvPicPr>
-                      <a:picLocks noChangeAspect="1" noChangeArrowheads="1"/>
-                    </pic:cNvPicPr>
-                  </pic:nvPicPr>
-                  <pic:blipFill>
-                    <a:blip r:embed="rId36">
-                      <a:extLst>
-                        <a:ext uri="{28A0092B-C50C-407E-A947-70E740481C1C}">
-                          <a14:useLocalDpi xmlns:a14="http://schemas.microsoft.com/office/drawing/2010/main" val="0"/>
-                        </a:ext>
-                      </a:extLst>
-                    </a:blip>
-                    <a:srcRect/>
-                    <a:stretch>
-                      <a:fillRect/>
-                    </a:stretch>
-                  </pic:blipFill>
-                  <pic:spPr bwMode="auto">
-                    <a:xfrm>
-                      <a:off x="0" y="0"/>
-                      <a:ext cx="6067425" cy="2314575"/>
-                    </a:xfrm>
-                    <a:prstGeom prst="rect">
-                      <a:avLst/>
-                    </a:prstGeom>
-                    <a:noFill/>
-                    <a:ln>
-                      <a:noFill/>
-                    </a:ln>
-                  </pic:spPr>
-                </pic:pic>
-              </a:graphicData>
-            </a:graphic>
-          </wp:inline>
-        </w:drawing>
-      </w:r>
-    </w:p>
-    <w:p>
-      <w:pPr>
         <w:pStyle w:val="Titulosgenerales"/>
         <w:rPr>
           <w:lang w:val="es-CO"/>
         </w:rPr>
       </w:pPr>
-      <w:bookmarkStart w:id="15" w:name="_Toc201852700"/>
+      <w:bookmarkStart w:id="15" w:name="_Toc202361367"/>
       <w:r>
         <w:rPr>
           <w:lang w:val="es-CO"/>
@@ -13956,7 +13956,7 @@
                     </pic:cNvPicPr>
                   </pic:nvPicPr>
                   <pic:blipFill>
-                    <a:blip r:embed="rId37">
+                    <a:blip r:embed="rId36">
                       <a:extLst>
                         <a:ext uri="{28A0092B-C50C-407E-A947-70E740481C1C}">
                           <a14:useLocalDpi xmlns:a14="http://schemas.microsoft.com/office/drawing/2010/main" val="0"/>
@@ -14018,7 +14018,7 @@
           <w:lang w:val="es-CO"/>
         </w:rPr>
       </w:pPr>
-      <w:bookmarkStart w:id="16" w:name="_Toc201852701"/>
+      <w:bookmarkStart w:id="16" w:name="_Toc202361368"/>
       <w:r>
         <w:rPr>
           <w:lang w:val="es-CO"/>
@@ -14210,7 +14210,7 @@
                 <w:rStyle w:val="Hipervnculo"/>
               </w:rPr>
             </w:pPr>
-            <w:hyperlink r:id="rId38" w:history="1">
+            <w:hyperlink r:id="rId37" w:history="1">
               <w:r>
                 <w:rPr>
                   <w:rStyle w:val="Hipervnculo"/>
@@ -14310,7 +14310,7 @@
             <w:pPr>
               <w:pStyle w:val="TextoTablas"/>
             </w:pPr>
-            <w:hyperlink r:id="rId39" w:history="1">
+            <w:hyperlink r:id="rId38" w:history="1">
               <w:r>
                 <w:rPr>
                   <w:rStyle w:val="Hipervnculo"/>
@@ -14341,7 +14341,7 @@
           <w:lang w:val="es-CO"/>
         </w:rPr>
       </w:pPr>
-      <w:bookmarkStart w:id="17" w:name="_Toc201852702"/>
+      <w:bookmarkStart w:id="17" w:name="_Toc202361369"/>
       <w:r>
         <w:rPr>
           <w:lang w:val="es-CO"/>
@@ -14515,7 +14515,7 @@
           <w:lang w:val="es-CO"/>
         </w:rPr>
       </w:pPr>
-      <w:bookmarkStart w:id="18" w:name="_Toc201852703"/>
+      <w:bookmarkStart w:id="18" w:name="_Toc202361370"/>
       <w:r>
         <w:rPr>
           <w:lang w:val="es-CO"/>
@@ -14665,7 +14665,7 @@
           <w:lang w:val="es-CO"/>
         </w:rPr>
       </w:pPr>
-      <w:bookmarkStart w:id="19" w:name="_Toc201852704"/>
+      <w:bookmarkStart w:id="19" w:name="_Toc202361371"/>
       <w:r>
         <w:rPr>
           <w:lang w:val="es-CO"/>
@@ -15778,8 +15778,8 @@
       </w:pPr>
     </w:p>
     <w:sectPr>
-      <w:headerReference w:type="default" r:id="rId40"/>
-      <w:footerReference w:type="default" r:id="rId41"/>
+      <w:headerReference w:type="default" r:id="rId39"/>
+      <w:footerReference w:type="default" r:id="rId40"/>
       <w:pgSz w:w="12240" w:h="15840"/>
       <w:pgMar w:top="1701" w:right="1134" w:bottom="1134" w:left="1134" w:header="709" w:footer="737" w:gutter="0"/>
       <w:pgNumType w:start="1"/>
@@ -24734,6 +24734,7 @@
   <w:style w:type="character" w:default="1" w:styleId="Fuentedeprrafopredeter">
     <w:name w:val="Default Paragraph Font"/>
     <w:uiPriority w:val="1"/>
+    <w:semiHidden/>
     <w:unhideWhenUsed/>
   </w:style>
   <w:style w:type="table" w:default="1" w:styleId="Tablanormal">
@@ -25902,6 +25903,10 @@
 </file>
 
 <file path=customXml/item1.xml><?xml version="1.0" encoding="utf-8"?>
+<b:Sources xmlns:b="http://schemas.openxmlformats.org/officeDocument/2006/bibliography" xmlns="http://schemas.openxmlformats.org/officeDocument/2006/bibliography" SelectedStyle="\APASixthEditionOfficeOnline.xsl" StyleName="APA" Version="6"/>
+</file>
+
+<file path=customXml/item2.xml><?xml version="1.0" encoding="utf-8"?>
 <ct:contentTypeSchema xmlns:ct="http://schemas.microsoft.com/office/2006/metadata/contentType" xmlns:ma="http://schemas.microsoft.com/office/2006/metadata/properties/metaAttributes" ct:_="" ma:_="" ma:contentTypeName="Documento" ma:contentTypeID="0x01010049282E1EDBE9234EA9E6D38F720E265F" ma:contentTypeVersion="15" ma:contentTypeDescription="Crear nuevo documento." ma:contentTypeScope="" ma:versionID="b31c7aa9eaf043a08b87120b3c4916e3">
   <xsd:schema xmlns:xsd="http://www.w3.org/2001/XMLSchema" xmlns:xs="http://www.w3.org/2001/XMLSchema" xmlns:p="http://schemas.microsoft.com/office/2006/metadata/properties" xmlns:ns2="cb45339b-ced9-4d0d-8f64-77573914d53b" xmlns:ns3="43a3ca16-9c26-4813-b83f-4aec9927b43f" targetNamespace="http://schemas.microsoft.com/office/2006/metadata/properties" ma:root="true" ma:fieldsID="3533d065b04d75c457075bc55f1f5315" ns2:_="" ns3:_="">
     <xsd:import namespace="cb45339b-ced9-4d0d-8f64-77573914d53b"/>
@@ -26136,20 +26141,7 @@
 </ct:contentTypeSchema>
 </file>
 
-<file path=customXml/item2.xml><?xml version="1.0" encoding="utf-8"?>
-<b:Sources xmlns:b="http://schemas.openxmlformats.org/officeDocument/2006/bibliography" xmlns="http://schemas.openxmlformats.org/officeDocument/2006/bibliography" SelectedStyle="\APASixthEditionOfficeOnline.xsl" StyleName="APA" Version="6"/>
-</file>
-
 <file path=customXml/item3.xml><?xml version="1.0" encoding="utf-8"?>
-<?mso-contentType ?>
-<FormTemplates xmlns="http://schemas.microsoft.com/sharepoint/v3/contenttype/forms">
-  <Display>DocumentLibraryForm</Display>
-  <Edit>DocumentLibraryForm</Edit>
-  <New>DocumentLibraryForm</New>
-</FormTemplates>
-</file>
-
-<file path=customXml/item4.xml><?xml version="1.0" encoding="utf-8"?>
 <p:properties xmlns:p="http://schemas.microsoft.com/office/2006/metadata/properties" xmlns:xsi="http://www.w3.org/2001/XMLSchema-instance" xmlns:pc="http://schemas.microsoft.com/office/infopath/2007/PartnerControls">
   <documentManagement>
     <TaxCatchAll xmlns="cb45339b-ced9-4d0d-8f64-77573914d53b" xsi:nil="true"/>
@@ -26160,7 +26152,24 @@
 </p:properties>
 </file>
 
+<file path=customXml/item4.xml><?xml version="1.0" encoding="utf-8"?>
+<?mso-contentType ?>
+<FormTemplates xmlns="http://schemas.microsoft.com/sharepoint/v3/contenttype/forms">
+  <Display>DocumentLibraryForm</Display>
+  <Edit>DocumentLibraryForm</Edit>
+  <New>DocumentLibraryForm</New>
+</FormTemplates>
+</file>
+
 <file path=customXml/itemProps1.xml><?xml version="1.0" encoding="utf-8"?>
+<ds:datastoreItem xmlns:ds="http://schemas.openxmlformats.org/officeDocument/2006/customXml" ds:itemID="{EAE431FD-7059-4C09-804B-C9D69EB7B213}">
+  <ds:schemaRefs>
+    <ds:schemaRef ds:uri="http://schemas.openxmlformats.org/officeDocument/2006/bibliography"/>
+  </ds:schemaRefs>
+</ds:datastoreItem>
+</file>
+
+<file path=customXml/itemProps2.xml><?xml version="1.0" encoding="utf-8"?>
 <ds:datastoreItem xmlns:ds="http://schemas.openxmlformats.org/officeDocument/2006/customXml" ds:itemID="{ABC43734-40DA-4258-8AC6-EC91AAFFC9CD}">
   <ds:schemaRefs>
     <ds:schemaRef ds:uri="http://schemas.microsoft.com/office/2006/metadata/contentType"/>
@@ -26179,23 +26188,7 @@
 </ds:datastoreItem>
 </file>
 
-<file path=customXml/itemProps2.xml><?xml version="1.0" encoding="utf-8"?>
-<ds:datastoreItem xmlns:ds="http://schemas.openxmlformats.org/officeDocument/2006/customXml" ds:itemID="{EAE431FD-7059-4C09-804B-C9D69EB7B213}">
-  <ds:schemaRefs>
-    <ds:schemaRef ds:uri="http://schemas.openxmlformats.org/officeDocument/2006/bibliography"/>
-  </ds:schemaRefs>
-</ds:datastoreItem>
-</file>
-
 <file path=customXml/itemProps3.xml><?xml version="1.0" encoding="utf-8"?>
-<ds:datastoreItem xmlns:ds="http://schemas.openxmlformats.org/officeDocument/2006/customXml" ds:itemID="{10663269-2064-4804-8290-36D4A57F5557}">
-  <ds:schemaRefs>
-    <ds:schemaRef ds:uri="http://schemas.microsoft.com/sharepoint/v3/contenttype/forms"/>
-  </ds:schemaRefs>
-</ds:datastoreItem>
-</file>
-
-<file path=customXml/itemProps4.xml><?xml version="1.0" encoding="utf-8"?>
 <ds:datastoreItem xmlns:ds="http://schemas.openxmlformats.org/officeDocument/2006/customXml" ds:itemID="{1279454D-02BE-4A9C-A117-DCD1573E2608}">
   <ds:schemaRefs>
     <ds:schemaRef ds:uri="http://schemas.microsoft.com/office/2006/metadata/properties"/>
@@ -26204,4 +26197,12 @@
     <ds:schemaRef ds:uri="43a3ca16-9c26-4813-b83f-4aec9927b43f"/>
   </ds:schemaRefs>
 </ds:datastoreItem>
+</file>
+
+<file path=customXml/itemProps4.xml><?xml version="1.0" encoding="utf-8"?>
+<ds:datastoreItem xmlns:ds="http://schemas.openxmlformats.org/officeDocument/2006/customXml" ds:itemID="{10663269-2064-4804-8290-36D4A57F5557}">
+  <ds:schemaRefs>
+    <ds:schemaRef ds:uri="http://schemas.microsoft.com/sharepoint/v3/contenttype/forms"/>
+  </ds:schemaRefs>
+</ds:datastoreItem>
 </file>
</xml_diff>